<commit_message>
TeSI v2 mise en page : nombres verticaux alignes, ST gras italique, resume a droite, titre centre
Co-authored-by: arena-agent <297053741+arena-agent@users.noreply.github.com>
</commit_message>
<xml_diff>
--- a/pe-2026-2027/PEC_TeSI_2026_2027_v2.docx
+++ b/pe-2026-2027/PEC_TeSI_2026_2027_v2.docx
@@ -111,7 +111,7 @@
           <w:p>
             <w:pPr>
               <w:spacing w:after="20"/>
-              <w:jc w:val="right"/>
+              <w:jc w:val="center"/>
             </w:pPr>
             <w:r/>
             <w:r>
@@ -126,7 +126,7 @@
           <w:p>
             <w:pPr>
               <w:spacing w:after="20"/>
-              <w:jc w:val="right"/>
+              <w:jc w:val="center"/>
             </w:pPr>
             <w:r>
               <w:rPr>
@@ -140,7 +140,7 @@
           <w:p>
             <w:pPr>
               <w:spacing w:after="20"/>
-              <w:jc w:val="right"/>
+              <w:jc w:val="center"/>
             </w:pPr>
             <w:r>
               <w:rPr>
@@ -154,7 +154,7 @@
           <w:p>
             <w:pPr>
               <w:spacing w:after="20"/>
-              <w:jc w:val="left"/>
+              <w:jc w:val="right"/>
             </w:pPr>
             <w:r>
               <w:rPr>
@@ -168,7 +168,7 @@
           <w:p>
             <w:pPr>
               <w:spacing w:after="20"/>
-              <w:jc w:val="left"/>
+              <w:jc w:val="right"/>
             </w:pPr>
             <w:r>
               <w:rPr>
@@ -182,7 +182,7 @@
           <w:p>
             <w:pPr>
               <w:spacing w:after="20"/>
-              <w:jc w:val="left"/>
+              <w:jc w:val="right"/>
             </w:pPr>
             <w:r>
               <w:rPr>
@@ -190,13 +190,13 @@
                 <w:b w:val="0"/>
                 <w:sz w:val="18"/>
               </w:rPr>
-              <w:t>Isan’ny Mpianatra tamin’ny taon-dasa : V 71   L 72   T 143 (fin)</w:t>
+              <w:t>Isan’ny Mpianatra tamin’ny taon-dasa : V 68   L 61   T 129</w:t>
             </w:r>
           </w:p>
           <w:p>
             <w:pPr>
               <w:spacing w:after="20"/>
-              <w:jc w:val="left"/>
+              <w:jc w:val="right"/>
             </w:pPr>
             <w:r>
               <w:rPr>
@@ -210,7 +210,7 @@
           <w:p>
             <w:pPr>
               <w:spacing w:after="20"/>
-              <w:jc w:val="left"/>
+              <w:jc w:val="right"/>
             </w:pPr>
             <w:r>
               <w:rPr>
@@ -224,7 +224,7 @@
           <w:p>
             <w:pPr>
               <w:spacing w:after="20"/>
-              <w:jc w:val="left"/>
+              <w:jc w:val="right"/>
             </w:pPr>
             <w:r>
               <w:rPr>
@@ -238,7 +238,7 @@
           <w:p>
             <w:pPr>
               <w:spacing w:after="20"/>
-              <w:jc w:val="left"/>
+              <w:jc w:val="right"/>
             </w:pPr>
             <w:r>
               <w:rPr>
@@ -246,13 +246,13 @@
                 <w:b w:val="0"/>
                 <w:sz w:val="18"/>
               </w:rPr>
-              <w:t>Tetibidy novinavinaina : 9 286 000 Ar (RAM + VOI)</w:t>
+              <w:t>Tetibidy novinavinaina : 9 286 000 Ar</w:t>
             </w:r>
           </w:p>
           <w:p>
             <w:pPr>
               <w:spacing w:after="20"/>
-              <w:jc w:val="left"/>
+              <w:jc w:val="right"/>
             </w:pPr>
             <w:r>
               <w:rPr>
@@ -302,6 +302,7 @@
               <w:rPr>
                 <w:rFonts w:ascii="Times New Roman" w:hAnsi="Times New Roman"/>
                 <w:b/>
+                <w:i w:val="0"/>
                 <w:sz w:val="16"/>
               </w:rPr>
               <w:t>SEHATRA</w:t>
@@ -324,6 +325,7 @@
               <w:rPr>
                 <w:rFonts w:ascii="Times New Roman" w:hAnsi="Times New Roman"/>
                 <w:b/>
+                <w:i w:val="0"/>
                 <w:sz w:val="16"/>
               </w:rPr>
               <w:t>LAHASA</w:t>
@@ -346,6 +348,7 @@
               <w:rPr>
                 <w:rFonts w:ascii="Times New Roman" w:hAnsi="Times New Roman"/>
                 <w:b/>
+                <w:i w:val="0"/>
                 <w:sz w:val="16"/>
               </w:rPr>
               <w:t>FE-POTOANA</w:t>
@@ -368,6 +371,7 @@
               <w:rPr>
                 <w:rFonts w:ascii="Times New Roman" w:hAnsi="Times New Roman"/>
                 <w:b/>
+                <w:i w:val="0"/>
                 <w:sz w:val="16"/>
               </w:rPr>
               <w:t>ASA</w:t>
@@ -390,6 +394,7 @@
               <w:rPr>
                 <w:rFonts w:ascii="Times New Roman" w:hAnsi="Times New Roman"/>
                 <w:b/>
+                <w:i w:val="0"/>
                 <w:sz w:val="16"/>
               </w:rPr>
               <w:t>TETIBIDY</w:t>
@@ -412,6 +417,7 @@
               <w:rPr>
                 <w:rFonts w:ascii="Times New Roman" w:hAnsi="Times New Roman"/>
                 <w:b/>
+                <w:i w:val="0"/>
                 <w:sz w:val="16"/>
               </w:rPr>
               <w:t>LOHARANOM-</w:t>
@@ -426,6 +432,7 @@
               <w:rPr>
                 <w:rFonts w:ascii="Times New Roman" w:hAnsi="Times New Roman"/>
                 <w:b/>
+                <w:i w:val="0"/>
                 <w:sz w:val="16"/>
               </w:rPr>
               <w:t>BOLA</w:t>
@@ -448,6 +455,7 @@
               <w:rPr>
                 <w:rFonts w:ascii="Times New Roman" w:hAnsi="Times New Roman"/>
                 <w:b/>
+                <w:i w:val="0"/>
                 <w:sz w:val="16"/>
               </w:rPr>
               <w:t>MPANATA-</w:t>
@@ -462,6 +470,7 @@
               <w:rPr>
                 <w:rFonts w:ascii="Times New Roman" w:hAnsi="Times New Roman"/>
                 <w:b/>
+                <w:i w:val="0"/>
                 <w:sz w:val="16"/>
               </w:rPr>
               <w:t>NTERAKA</w:t>
@@ -484,6 +493,7 @@
               <w:rPr>
                 <w:rFonts w:ascii="Times New Roman" w:hAnsi="Times New Roman"/>
                 <w:b/>
+                <w:i w:val="0"/>
                 <w:sz w:val="16"/>
               </w:rPr>
               <w:t>MPIANDRAIKITRA</w:t>
@@ -498,6 +508,7 @@
               <w:rPr>
                 <w:rFonts w:ascii="Times New Roman" w:hAnsi="Times New Roman"/>
                 <w:b/>
+                <w:i w:val="0"/>
                 <w:sz w:val="16"/>
               </w:rPr>
               <w:t>NY FANJOHIANA</w:t>
@@ -549,6 +560,7 @@
               <w:rPr>
                 <w:rFonts w:ascii="Times New Roman" w:hAnsi="Times New Roman"/>
                 <w:b/>
+                <w:i w:val="0"/>
                 <w:sz w:val="16"/>
               </w:rPr>
               <w:t>Isa</w:t>
@@ -570,6 +582,7 @@
               <w:rPr>
                 <w:rFonts w:ascii="Times New Roman" w:hAnsi="Times New Roman"/>
                 <w:b/>
+                <w:i w:val="0"/>
                 <w:sz w:val="16"/>
               </w:rPr>
               <w:t>Vidin’ny iray</w:t>
@@ -591,6 +604,7 @@
               <w:rPr>
                 <w:rFonts w:ascii="Times New Roman" w:hAnsi="Times New Roman"/>
                 <w:b/>
+                <w:i w:val="0"/>
                 <w:sz w:val="16"/>
               </w:rPr>
               <w:t>Totalim-bola</w:t>
@@ -636,6 +650,7 @@
               <w:rPr>
                 <w:rFonts w:ascii="Times New Roman" w:hAnsi="Times New Roman"/>
                 <w:b/>
+                <w:i w:val="0"/>
                 <w:sz w:val="16"/>
               </w:rPr>
               <w:t>FOTOANA IANARANA</w:t>
@@ -658,6 +673,7 @@
               <w:rPr>
                 <w:rFonts w:ascii="Times New Roman" w:hAnsi="Times New Roman"/>
                 <w:b w:val="0"/>
+                <w:i w:val="0"/>
                 <w:sz w:val="16"/>
               </w:rPr>
               <w:t>Fanatanterahana ny fianarana (Fianarana sy ny Ora Fanarenana « OF »)</w:t>
@@ -680,6 +696,7 @@
               <w:rPr>
                 <w:rFonts w:ascii="Times New Roman" w:hAnsi="Times New Roman"/>
                 <w:b w:val="0"/>
+                <w:i w:val="0"/>
                 <w:sz w:val="16"/>
               </w:rPr>
               <w:t>Septambra 2026 – Jona 2027</w:t>
@@ -701,7 +718,8 @@
               <w:rPr>
                 <w:rFonts w:ascii="Times New Roman" w:hAnsi="Times New Roman"/>
                 <w:b w:val="0"/>
-                <w:sz w:val="16"/>
+                <w:i w:val="0"/>
+                <w:sz w:val="18"/>
               </w:rPr>
               <w:t>Fividianana :</w:t>
             </w:r>
@@ -715,7 +733,8 @@
               <w:rPr>
                 <w:rFonts w:ascii="Times New Roman" w:hAnsi="Times New Roman"/>
                 <w:b w:val="0"/>
-                <w:sz w:val="16"/>
+                <w:i w:val="0"/>
+                <w:sz w:val="18"/>
               </w:rPr>
               <w:t>• Craie couleur RAFAFA</w:t>
             </w:r>
@@ -729,7 +748,8 @@
               <w:rPr>
                 <w:rFonts w:ascii="Times New Roman" w:hAnsi="Times New Roman"/>
                 <w:b w:val="0"/>
-                <w:sz w:val="16"/>
+                <w:i w:val="0"/>
+                <w:sz w:val="18"/>
               </w:rPr>
               <w:t>• Craie blanche RAFAFA</w:t>
             </w:r>
@@ -743,7 +763,8 @@
               <w:rPr>
                 <w:rFonts w:ascii="Times New Roman" w:hAnsi="Times New Roman"/>
                 <w:b w:val="0"/>
-                <w:sz w:val="16"/>
+                <w:i w:val="0"/>
+                <w:sz w:val="18"/>
               </w:rPr>
               <w:t>• Eponge</w:t>
             </w:r>
@@ -757,7 +778,8 @@
               <w:rPr>
                 <w:rFonts w:ascii="Times New Roman" w:hAnsi="Times New Roman"/>
                 <w:b w:val="0"/>
-                <w:sz w:val="16"/>
+                <w:i w:val="0"/>
+                <w:sz w:val="18"/>
               </w:rPr>
               <w:t>• Isorel</w:t>
             </w:r>
@@ -771,7 +793,8 @@
               <w:rPr>
                 <w:rFonts w:ascii="Times New Roman" w:hAnsi="Times New Roman"/>
                 <w:b w:val="0"/>
-                <w:sz w:val="16"/>
+                <w:i w:val="0"/>
+                <w:sz w:val="18"/>
               </w:rPr>
               <w:t>• Ody parasy sachets</w:t>
             </w:r>
@@ -785,7 +808,8 @@
               <w:rPr>
                 <w:rFonts w:ascii="Times New Roman" w:hAnsi="Times New Roman"/>
                 <w:b w:val="0"/>
-                <w:sz w:val="16"/>
+                <w:i w:val="0"/>
+                <w:sz w:val="18"/>
               </w:rPr>
               <w:t>• Siflet vy</w:t>
             </w:r>
@@ -806,9 +830,99 @@
               <w:rPr>
                 <w:rFonts w:ascii="Times New Roman" w:hAnsi="Times New Roman"/>
                 <w:b w:val="0"/>
-                <w:sz w:val="16"/>
-              </w:rPr>
-              <w:t>10 25 21 2 3 6</w:t>
+                <w:i w:val="0"/>
+                <w:sz w:val="18"/>
+              </w:rPr>
+            </w:r>
+          </w:p>
+          <w:p>
+            <w:pPr>
+              <w:spacing w:after="0" w:before="0"/>
+              <w:jc w:val="center"/>
+            </w:pPr>
+            <w:r>
+              <w:rPr>
+                <w:rFonts w:ascii="Times New Roman" w:hAnsi="Times New Roman"/>
+                <w:b w:val="0"/>
+                <w:i w:val="0"/>
+                <w:sz w:val="18"/>
+              </w:rPr>
+              <w:t>10</w:t>
+            </w:r>
+          </w:p>
+          <w:p>
+            <w:pPr>
+              <w:spacing w:after="0" w:before="0"/>
+              <w:jc w:val="center"/>
+            </w:pPr>
+            <w:r>
+              <w:rPr>
+                <w:rFonts w:ascii="Times New Roman" w:hAnsi="Times New Roman"/>
+                <w:b w:val="0"/>
+                <w:i w:val="0"/>
+                <w:sz w:val="18"/>
+              </w:rPr>
+              <w:t>25</w:t>
+            </w:r>
+          </w:p>
+          <w:p>
+            <w:pPr>
+              <w:spacing w:after="0" w:before="0"/>
+              <w:jc w:val="center"/>
+            </w:pPr>
+            <w:r>
+              <w:rPr>
+                <w:rFonts w:ascii="Times New Roman" w:hAnsi="Times New Roman"/>
+                <w:b w:val="0"/>
+                <w:i w:val="0"/>
+                <w:sz w:val="18"/>
+              </w:rPr>
+              <w:t>21</w:t>
+            </w:r>
+          </w:p>
+          <w:p>
+            <w:pPr>
+              <w:spacing w:after="0" w:before="0"/>
+              <w:jc w:val="center"/>
+            </w:pPr>
+            <w:r>
+              <w:rPr>
+                <w:rFonts w:ascii="Times New Roman" w:hAnsi="Times New Roman"/>
+                <w:b w:val="0"/>
+                <w:i w:val="0"/>
+                <w:sz w:val="18"/>
+              </w:rPr>
+              <w:t>2</w:t>
+            </w:r>
+          </w:p>
+          <w:p>
+            <w:pPr>
+              <w:spacing w:after="0" w:before="0"/>
+              <w:jc w:val="center"/>
+            </w:pPr>
+            <w:r>
+              <w:rPr>
+                <w:rFonts w:ascii="Times New Roman" w:hAnsi="Times New Roman"/>
+                <w:b w:val="0"/>
+                <w:i w:val="0"/>
+                <w:sz w:val="18"/>
+              </w:rPr>
+              <w:t>3</w:t>
+            </w:r>
+          </w:p>
+          <w:p>
+            <w:pPr>
+              <w:spacing w:after="0" w:before="0"/>
+              <w:jc w:val="center"/>
+            </w:pPr>
+            <w:r>
+              <w:rPr>
+                <w:rFonts w:ascii="Times New Roman" w:hAnsi="Times New Roman"/>
+                <w:b w:val="0"/>
+                <w:i w:val="0"/>
+                <w:sz w:val="18"/>
+              </w:rPr>
+              <w:t>6</w:t>
             </w:r>
           </w:p>
         </w:tc>
@@ -827,9 +941,99 @@
               <w:rPr>
                 <w:rFonts w:ascii="Times New Roman" w:hAnsi="Times New Roman"/>
                 <w:b w:val="0"/>
-                <w:sz w:val="16"/>
-              </w:rPr>
-              <w:t>6 000 5 000 700 58 000 3 000 1 800</w:t>
+                <w:i w:val="0"/>
+                <w:sz w:val="18"/>
+              </w:rPr>
+            </w:r>
+          </w:p>
+          <w:p>
+            <w:pPr>
+              <w:spacing w:after="0" w:before="0"/>
+              <w:jc w:val="center"/>
+            </w:pPr>
+            <w:r>
+              <w:rPr>
+                <w:rFonts w:ascii="Times New Roman" w:hAnsi="Times New Roman"/>
+                <w:b w:val="0"/>
+                <w:i w:val="0"/>
+                <w:sz w:val="18"/>
+              </w:rPr>
+              <w:t>6 000</w:t>
+            </w:r>
+          </w:p>
+          <w:p>
+            <w:pPr>
+              <w:spacing w:after="0" w:before="0"/>
+              <w:jc w:val="center"/>
+            </w:pPr>
+            <w:r>
+              <w:rPr>
+                <w:rFonts w:ascii="Times New Roman" w:hAnsi="Times New Roman"/>
+                <w:b w:val="0"/>
+                <w:i w:val="0"/>
+                <w:sz w:val="18"/>
+              </w:rPr>
+              <w:t>5 000</w:t>
+            </w:r>
+          </w:p>
+          <w:p>
+            <w:pPr>
+              <w:spacing w:after="0" w:before="0"/>
+              <w:jc w:val="center"/>
+            </w:pPr>
+            <w:r>
+              <w:rPr>
+                <w:rFonts w:ascii="Times New Roman" w:hAnsi="Times New Roman"/>
+                <w:b w:val="0"/>
+                <w:i w:val="0"/>
+                <w:sz w:val="18"/>
+              </w:rPr>
+              <w:t>700</w:t>
+            </w:r>
+          </w:p>
+          <w:p>
+            <w:pPr>
+              <w:spacing w:after="0" w:before="0"/>
+              <w:jc w:val="center"/>
+            </w:pPr>
+            <w:r>
+              <w:rPr>
+                <w:rFonts w:ascii="Times New Roman" w:hAnsi="Times New Roman"/>
+                <w:b w:val="0"/>
+                <w:i w:val="0"/>
+                <w:sz w:val="18"/>
+              </w:rPr>
+              <w:t>58 000</w:t>
+            </w:r>
+          </w:p>
+          <w:p>
+            <w:pPr>
+              <w:spacing w:after="0" w:before="0"/>
+              <w:jc w:val="center"/>
+            </w:pPr>
+            <w:r>
+              <w:rPr>
+                <w:rFonts w:ascii="Times New Roman" w:hAnsi="Times New Roman"/>
+                <w:b w:val="0"/>
+                <w:i w:val="0"/>
+                <w:sz w:val="18"/>
+              </w:rPr>
+              <w:t>3 000</w:t>
+            </w:r>
+          </w:p>
+          <w:p>
+            <w:pPr>
+              <w:spacing w:after="0" w:before="0"/>
+              <w:jc w:val="center"/>
+            </w:pPr>
+            <w:r>
+              <w:rPr>
+                <w:rFonts w:ascii="Times New Roman" w:hAnsi="Times New Roman"/>
+                <w:b w:val="0"/>
+                <w:i w:val="0"/>
+                <w:sz w:val="18"/>
+              </w:rPr>
+              <w:t>1 800</w:t>
             </w:r>
           </w:p>
         </w:tc>
@@ -848,9 +1052,9 @@
               <w:rPr>
                 <w:rFonts w:ascii="Times New Roman" w:hAnsi="Times New Roman"/>
                 <w:b w:val="0"/>
-                <w:sz w:val="16"/>
-              </w:rPr>
-              <w:t>60 000 125 000 14 700 116 000 9 000 10 800</w:t>
+                <w:i w:val="0"/>
+                <w:sz w:val="18"/>
+              </w:rPr>
             </w:r>
           </w:p>
           <w:p>
@@ -862,7 +1066,98 @@
               <w:rPr>
                 <w:rFonts w:ascii="Times New Roman" w:hAnsi="Times New Roman"/>
                 <w:b w:val="0"/>
-                <w:sz w:val="16"/>
+                <w:i w:val="0"/>
+                <w:sz w:val="18"/>
+              </w:rPr>
+              <w:t>60 000</w:t>
+            </w:r>
+          </w:p>
+          <w:p>
+            <w:pPr>
+              <w:spacing w:after="0" w:before="0"/>
+              <w:jc w:val="center"/>
+            </w:pPr>
+            <w:r>
+              <w:rPr>
+                <w:rFonts w:ascii="Times New Roman" w:hAnsi="Times New Roman"/>
+                <w:b w:val="0"/>
+                <w:i w:val="0"/>
+                <w:sz w:val="18"/>
+              </w:rPr>
+              <w:t>125 000</w:t>
+            </w:r>
+          </w:p>
+          <w:p>
+            <w:pPr>
+              <w:spacing w:after="0" w:before="0"/>
+              <w:jc w:val="center"/>
+            </w:pPr>
+            <w:r>
+              <w:rPr>
+                <w:rFonts w:ascii="Times New Roman" w:hAnsi="Times New Roman"/>
+                <w:b w:val="0"/>
+                <w:i w:val="0"/>
+                <w:sz w:val="18"/>
+              </w:rPr>
+              <w:t>14 700</w:t>
+            </w:r>
+          </w:p>
+          <w:p>
+            <w:pPr>
+              <w:spacing w:after="0" w:before="0"/>
+              <w:jc w:val="center"/>
+            </w:pPr>
+            <w:r>
+              <w:rPr>
+                <w:rFonts w:ascii="Times New Roman" w:hAnsi="Times New Roman"/>
+                <w:b w:val="0"/>
+                <w:i w:val="0"/>
+                <w:sz w:val="18"/>
+              </w:rPr>
+              <w:t>116 000</w:t>
+            </w:r>
+          </w:p>
+          <w:p>
+            <w:pPr>
+              <w:spacing w:after="0" w:before="0"/>
+              <w:jc w:val="center"/>
+            </w:pPr>
+            <w:r>
+              <w:rPr>
+                <w:rFonts w:ascii="Times New Roman" w:hAnsi="Times New Roman"/>
+                <w:b w:val="0"/>
+                <w:i w:val="0"/>
+                <w:sz w:val="18"/>
+              </w:rPr>
+              <w:t>9 000</w:t>
+            </w:r>
+          </w:p>
+          <w:p>
+            <w:pPr>
+              <w:spacing w:after="0" w:before="0"/>
+              <w:jc w:val="center"/>
+            </w:pPr>
+            <w:r>
+              <w:rPr>
+                <w:rFonts w:ascii="Times New Roman" w:hAnsi="Times New Roman"/>
+                <w:b w:val="0"/>
+                <w:i w:val="0"/>
+                <w:sz w:val="18"/>
+              </w:rPr>
+              <w:t>10 800</w:t>
+            </w:r>
+          </w:p>
+          <w:p>
+            <w:pPr>
+              <w:spacing w:after="0" w:before="0"/>
+              <w:jc w:val="center"/>
+            </w:pPr>
+            <w:r>
+              <w:rPr>
+                <w:rFonts w:ascii="Times New Roman" w:hAnsi="Times New Roman"/>
+                <w:b/>
+                <w:i/>
+                <w:sz w:val="18"/>
               </w:rPr>
               <w:t>ST : 335 500</w:t>
             </w:r>
@@ -883,6 +1178,7 @@
               <w:rPr>
                 <w:rFonts w:ascii="Times New Roman" w:hAnsi="Times New Roman"/>
                 <w:b w:val="0"/>
+                <w:i w:val="0"/>
                 <w:sz w:val="16"/>
               </w:rPr>
               <w:t>Caisse école : RPI (Etat)</w:t>
@@ -904,6 +1200,7 @@
               <w:rPr>
                 <w:rFonts w:ascii="Times New Roman" w:hAnsi="Times New Roman"/>
                 <w:b w:val="0"/>
+                <w:i w:val="0"/>
                 <w:sz w:val="16"/>
               </w:rPr>
               <w:t>Ny Filoha, Ny Tale, Ny Trésorier</w:t>
@@ -925,6 +1222,7 @@
               <w:rPr>
                 <w:rFonts w:ascii="Times New Roman" w:hAnsi="Times New Roman"/>
                 <w:b w:val="0"/>
+                <w:i w:val="0"/>
                 <w:sz w:val="16"/>
               </w:rPr>
               <w:t>Mpanara-maso ny kaonty, Tale, Membre FEFFI</w:t>
@@ -969,7 +1267,8 @@
               <w:rPr>
                 <w:rFonts w:ascii="Times New Roman" w:hAnsi="Times New Roman"/>
                 <w:b w:val="0"/>
-                <w:sz w:val="16"/>
+                <w:i w:val="0"/>
+                <w:sz w:val="18"/>
               </w:rPr>
               <w:t>• Ardoisine GM</w:t>
             </w:r>
@@ -983,7 +1282,8 @@
               <w:rPr>
                 <w:rFonts w:ascii="Times New Roman" w:hAnsi="Times New Roman"/>
                 <w:b w:val="0"/>
-                <w:sz w:val="16"/>
+                <w:i w:val="0"/>
+                <w:sz w:val="18"/>
               </w:rPr>
               <w:t>• Agrafe 4/6 boîte</w:t>
             </w:r>
@@ -997,7 +1297,8 @@
               <w:rPr>
                 <w:rFonts w:ascii="Times New Roman" w:hAnsi="Times New Roman"/>
                 <w:b w:val="0"/>
-                <w:sz w:val="16"/>
+                <w:i w:val="0"/>
+                <w:sz w:val="18"/>
               </w:rPr>
               <w:t>• Craie Rafafa couleur</w:t>
             </w:r>
@@ -1011,7 +1312,8 @@
               <w:rPr>
                 <w:rFonts w:ascii="Times New Roman" w:hAnsi="Times New Roman"/>
                 <w:b w:val="0"/>
-                <w:sz w:val="16"/>
+                <w:i w:val="0"/>
+                <w:sz w:val="18"/>
               </w:rPr>
               <w:t>• Craie blanche RAFAFA</w:t>
             </w:r>
@@ -1032,9 +1334,55 @@
               <w:rPr>
                 <w:rFonts w:ascii="Times New Roman" w:hAnsi="Times New Roman"/>
                 <w:b w:val="0"/>
-                <w:sz w:val="16"/>
-              </w:rPr>
-              <w:t>2 6 10 10</w:t>
+                <w:i w:val="0"/>
+                <w:sz w:val="18"/>
+              </w:rPr>
+              <w:t>2</w:t>
+            </w:r>
+          </w:p>
+          <w:p>
+            <w:pPr>
+              <w:spacing w:after="0" w:before="0"/>
+              <w:jc w:val="center"/>
+            </w:pPr>
+            <w:r>
+              <w:rPr>
+                <w:rFonts w:ascii="Times New Roman" w:hAnsi="Times New Roman"/>
+                <w:b w:val="0"/>
+                <w:i w:val="0"/>
+                <w:sz w:val="18"/>
+              </w:rPr>
+              <w:t>6</w:t>
+            </w:r>
+          </w:p>
+          <w:p>
+            <w:pPr>
+              <w:spacing w:after="0" w:before="0"/>
+              <w:jc w:val="center"/>
+            </w:pPr>
+            <w:r>
+              <w:rPr>
+                <w:rFonts w:ascii="Times New Roman" w:hAnsi="Times New Roman"/>
+                <w:b w:val="0"/>
+                <w:i w:val="0"/>
+                <w:sz w:val="18"/>
+              </w:rPr>
+              <w:t>10</w:t>
+            </w:r>
+          </w:p>
+          <w:p>
+            <w:pPr>
+              <w:spacing w:after="0" w:before="0"/>
+              <w:jc w:val="center"/>
+            </w:pPr>
+            <w:r>
+              <w:rPr>
+                <w:rFonts w:ascii="Times New Roman" w:hAnsi="Times New Roman"/>
+                <w:b w:val="0"/>
+                <w:i w:val="0"/>
+                <w:sz w:val="18"/>
+              </w:rPr>
+              <w:t>10</w:t>
             </w:r>
           </w:p>
         </w:tc>
@@ -1053,9 +1401,55 @@
               <w:rPr>
                 <w:rFonts w:ascii="Times New Roman" w:hAnsi="Times New Roman"/>
                 <w:b w:val="0"/>
-                <w:sz w:val="16"/>
-              </w:rPr>
-              <w:t>12 000 1 800 6 000 5 000</w:t>
+                <w:i w:val="0"/>
+                <w:sz w:val="18"/>
+              </w:rPr>
+              <w:t>12 000</w:t>
+            </w:r>
+          </w:p>
+          <w:p>
+            <w:pPr>
+              <w:spacing w:after="0" w:before="0"/>
+              <w:jc w:val="center"/>
+            </w:pPr>
+            <w:r>
+              <w:rPr>
+                <w:rFonts w:ascii="Times New Roman" w:hAnsi="Times New Roman"/>
+                <w:b w:val="0"/>
+                <w:i w:val="0"/>
+                <w:sz w:val="18"/>
+              </w:rPr>
+              <w:t>1 800</w:t>
+            </w:r>
+          </w:p>
+          <w:p>
+            <w:pPr>
+              <w:spacing w:after="0" w:before="0"/>
+              <w:jc w:val="center"/>
+            </w:pPr>
+            <w:r>
+              <w:rPr>
+                <w:rFonts w:ascii="Times New Roman" w:hAnsi="Times New Roman"/>
+                <w:b w:val="0"/>
+                <w:i w:val="0"/>
+                <w:sz w:val="18"/>
+              </w:rPr>
+              <w:t>6 000</w:t>
+            </w:r>
+          </w:p>
+          <w:p>
+            <w:pPr>
+              <w:spacing w:after="0" w:before="0"/>
+              <w:jc w:val="center"/>
+            </w:pPr>
+            <w:r>
+              <w:rPr>
+                <w:rFonts w:ascii="Times New Roman" w:hAnsi="Times New Roman"/>
+                <w:b w:val="0"/>
+                <w:i w:val="0"/>
+                <w:sz w:val="18"/>
+              </w:rPr>
+              <w:t>5 000</w:t>
             </w:r>
           </w:p>
         </w:tc>
@@ -1074,9 +1468,10 @@
               <w:rPr>
                 <w:rFonts w:ascii="Times New Roman" w:hAnsi="Times New Roman"/>
                 <w:b w:val="0"/>
-                <w:sz w:val="16"/>
-              </w:rPr>
-              <w:t>24 000 10 800 60 000 50 000</w:t>
+                <w:i w:val="0"/>
+                <w:sz w:val="18"/>
+              </w:rPr>
+              <w:t>24 000</w:t>
             </w:r>
           </w:p>
           <w:p>
@@ -1088,7 +1483,53 @@
               <w:rPr>
                 <w:rFonts w:ascii="Times New Roman" w:hAnsi="Times New Roman"/>
                 <w:b w:val="0"/>
-                <w:sz w:val="16"/>
+                <w:i w:val="0"/>
+                <w:sz w:val="18"/>
+              </w:rPr>
+              <w:t>10 800</w:t>
+            </w:r>
+          </w:p>
+          <w:p>
+            <w:pPr>
+              <w:spacing w:after="0" w:before="0"/>
+              <w:jc w:val="center"/>
+            </w:pPr>
+            <w:r>
+              <w:rPr>
+                <w:rFonts w:ascii="Times New Roman" w:hAnsi="Times New Roman"/>
+                <w:b w:val="0"/>
+                <w:i w:val="0"/>
+                <w:sz w:val="18"/>
+              </w:rPr>
+              <w:t>60 000</w:t>
+            </w:r>
+          </w:p>
+          <w:p>
+            <w:pPr>
+              <w:spacing w:after="0" w:before="0"/>
+              <w:jc w:val="center"/>
+            </w:pPr>
+            <w:r>
+              <w:rPr>
+                <w:rFonts w:ascii="Times New Roman" w:hAnsi="Times New Roman"/>
+                <w:b w:val="0"/>
+                <w:i w:val="0"/>
+                <w:sz w:val="18"/>
+              </w:rPr>
+              <w:t>50 000</w:t>
+            </w:r>
+          </w:p>
+          <w:p>
+            <w:pPr>
+              <w:spacing w:after="0" w:before="0"/>
+              <w:jc w:val="center"/>
+            </w:pPr>
+            <w:r>
+              <w:rPr>
+                <w:rFonts w:ascii="Times New Roman" w:hAnsi="Times New Roman"/>
+                <w:b/>
+                <w:i/>
+                <w:sz w:val="18"/>
               </w:rPr>
               <w:t>ST : 144 800</w:t>
             </w:r>
@@ -1109,6 +1550,7 @@
               <w:rPr>
                 <w:rFonts w:ascii="Times New Roman" w:hAnsi="Times New Roman"/>
                 <w:b w:val="0"/>
+                <w:i w:val="0"/>
                 <w:sz w:val="16"/>
               </w:rPr>
               <w:t>Caisse école : FCE</w:t>
@@ -1130,6 +1572,7 @@
               <w:rPr>
                 <w:rFonts w:ascii="Times New Roman" w:hAnsi="Times New Roman"/>
                 <w:b w:val="0"/>
+                <w:i w:val="0"/>
                 <w:sz w:val="16"/>
               </w:rPr>
               <w:t>–</w:t>
@@ -1151,6 +1594,7 @@
               <w:rPr>
                 <w:rFonts w:ascii="Times New Roman" w:hAnsi="Times New Roman"/>
                 <w:b w:val="0"/>
+                <w:i w:val="0"/>
                 <w:sz w:val="16"/>
               </w:rPr>
               <w:t>Membre FEFFI, Tale</w:t>
@@ -1181,6 +1625,7 @@
               <w:rPr>
                 <w:rFonts w:ascii="Times New Roman" w:hAnsi="Times New Roman"/>
                 <w:b w:val="0"/>
+                <w:i w:val="0"/>
                 <w:sz w:val="16"/>
               </w:rPr>
               <w:t>Fitiliana ny mpianatra ahiana hitsoaka andaharana (2026-2027)</w:t>
@@ -1202,6 +1647,7 @@
               <w:rPr>
                 <w:rFonts w:ascii="Times New Roman" w:hAnsi="Times New Roman"/>
                 <w:b w:val="0"/>
+                <w:i w:val="0"/>
                 <w:sz w:val="16"/>
               </w:rPr>
               <w:t>Isam-bolana</w:t>
@@ -1223,7 +1669,8 @@
               <w:rPr>
                 <w:rFonts w:ascii="Times New Roman" w:hAnsi="Times New Roman"/>
                 <w:b w:val="0"/>
-                <w:sz w:val="16"/>
+                <w:i w:val="0"/>
+                <w:sz w:val="18"/>
               </w:rPr>
               <w:t>Fanaovana lisitra</w:t>
             </w:r>
@@ -1244,7 +1691,8 @@
               <w:rPr>
                 <w:rFonts w:ascii="Times New Roman" w:hAnsi="Times New Roman"/>
                 <w:b w:val="0"/>
-                <w:sz w:val="16"/>
+                <w:i w:val="0"/>
+                <w:sz w:val="18"/>
               </w:rPr>
               <w:t>N/A</w:t>
             </w:r>
@@ -1265,7 +1713,8 @@
               <w:rPr>
                 <w:rFonts w:ascii="Times New Roman" w:hAnsi="Times New Roman"/>
                 <w:b w:val="0"/>
-                <w:sz w:val="16"/>
+                <w:i w:val="0"/>
+                <w:sz w:val="18"/>
               </w:rPr>
               <w:t>N/A</w:t>
             </w:r>
@@ -1286,7 +1735,8 @@
               <w:rPr>
                 <w:rFonts w:ascii="Times New Roman" w:hAnsi="Times New Roman"/>
                 <w:b w:val="0"/>
-                <w:sz w:val="16"/>
+                <w:i w:val="0"/>
+                <w:sz w:val="18"/>
               </w:rPr>
               <w:t>N/A</w:t>
             </w:r>
@@ -1307,6 +1757,7 @@
               <w:rPr>
                 <w:rFonts w:ascii="Times New Roman" w:hAnsi="Times New Roman"/>
                 <w:b w:val="0"/>
+                <w:i w:val="0"/>
                 <w:sz w:val="16"/>
               </w:rPr>
               <w:t>N/A</w:t>
@@ -1328,6 +1779,7 @@
               <w:rPr>
                 <w:rFonts w:ascii="Times New Roman" w:hAnsi="Times New Roman"/>
                 <w:b w:val="0"/>
+                <w:i w:val="0"/>
                 <w:sz w:val="16"/>
               </w:rPr>
               <w:t>Tale Mpampianatra</w:t>
@@ -1349,6 +1801,7 @@
               <w:rPr>
                 <w:rFonts w:ascii="Times New Roman" w:hAnsi="Times New Roman"/>
                 <w:b w:val="0"/>
+                <w:i w:val="0"/>
                 <w:sz w:val="16"/>
               </w:rPr>
               <w:t>Filohan’ny FEFFI, Tale</w:t>
@@ -1379,6 +1832,7 @@
               <w:rPr>
                 <w:rFonts w:ascii="Times New Roman" w:hAnsi="Times New Roman"/>
                 <w:b w:val="0"/>
+                <w:i w:val="0"/>
                 <w:sz w:val="16"/>
               </w:rPr>
               <w:t>VAD any an-tokantranon’ny mpianatra ahiana hitsoaka andaharana (2026-2027)</w:t>
@@ -1400,6 +1854,7 @@
               <w:rPr>
                 <w:rFonts w:ascii="Times New Roman" w:hAnsi="Times New Roman"/>
                 <w:b w:val="0"/>
+                <w:i w:val="0"/>
                 <w:sz w:val="16"/>
               </w:rPr>
               <w:t>Isam-bolana</w:t>
@@ -1421,7 +1876,8 @@
               <w:rPr>
                 <w:rFonts w:ascii="Times New Roman" w:hAnsi="Times New Roman"/>
                 <w:b w:val="0"/>
-                <w:sz w:val="16"/>
+                <w:i w:val="0"/>
+                <w:sz w:val="18"/>
               </w:rPr>
               <w:t>Fitiliana / Fandaminana sy Fandravonana VAD</w:t>
             </w:r>
@@ -1442,7 +1898,8 @@
               <w:rPr>
                 <w:rFonts w:ascii="Times New Roman" w:hAnsi="Times New Roman"/>
                 <w:b w:val="0"/>
-                <w:sz w:val="16"/>
+                <w:i w:val="0"/>
+                <w:sz w:val="18"/>
               </w:rPr>
               <w:t>N/A</w:t>
             </w:r>
@@ -1463,7 +1920,8 @@
               <w:rPr>
                 <w:rFonts w:ascii="Times New Roman" w:hAnsi="Times New Roman"/>
                 <w:b w:val="0"/>
-                <w:sz w:val="16"/>
+                <w:i w:val="0"/>
+                <w:sz w:val="18"/>
               </w:rPr>
               <w:t>N/A</w:t>
             </w:r>
@@ -1484,7 +1942,8 @@
               <w:rPr>
                 <w:rFonts w:ascii="Times New Roman" w:hAnsi="Times New Roman"/>
                 <w:b w:val="0"/>
-                <w:sz w:val="16"/>
+                <w:i w:val="0"/>
+                <w:sz w:val="18"/>
               </w:rPr>
               <w:t>N/A</w:t>
             </w:r>
@@ -1505,6 +1964,7 @@
               <w:rPr>
                 <w:rFonts w:ascii="Times New Roman" w:hAnsi="Times New Roman"/>
                 <w:b w:val="0"/>
+                <w:i w:val="0"/>
                 <w:sz w:val="16"/>
               </w:rPr>
               <w:t>N/A</w:t>
@@ -1526,6 +1986,7 @@
               <w:rPr>
                 <w:rFonts w:ascii="Times New Roman" w:hAnsi="Times New Roman"/>
                 <w:b w:val="0"/>
+                <w:i w:val="0"/>
                 <w:sz w:val="16"/>
               </w:rPr>
               <w:t>Membre FEFFI</w:t>
@@ -1547,6 +2008,7 @@
               <w:rPr>
                 <w:rFonts w:ascii="Times New Roman" w:hAnsi="Times New Roman"/>
                 <w:b w:val="0"/>
+                <w:i w:val="0"/>
                 <w:sz w:val="16"/>
               </w:rPr>
               <w:t>Président, Tale</w:t>
@@ -1571,6 +2033,7 @@
               <w:rPr>
                 <w:rFonts w:ascii="Times New Roman" w:hAnsi="Times New Roman"/>
                 <w:b/>
+                <w:i w:val="0"/>
                 <w:sz w:val="16"/>
               </w:rPr>
               <w:t>TONTOLO IANARANA / FITAOVANA</w:t>
@@ -1593,6 +2056,7 @@
               <w:rPr>
                 <w:rFonts w:ascii="Times New Roman" w:hAnsi="Times New Roman"/>
                 <w:b w:val="0"/>
+                <w:i w:val="0"/>
                 <w:sz w:val="16"/>
               </w:rPr>
               <w:t>Fanamboarana trano mpampianatra (logement)</w:t>
@@ -1615,6 +2079,7 @@
               <w:rPr>
                 <w:rFonts w:ascii="Times New Roman" w:hAnsi="Times New Roman"/>
                 <w:b w:val="0"/>
+                <w:i w:val="0"/>
                 <w:sz w:val="16"/>
               </w:rPr>
               <w:t>Septambra 2026 – Jona 2027</w:t>
@@ -1636,7 +2101,8 @@
               <w:rPr>
                 <w:rFonts w:ascii="Times New Roman" w:hAnsi="Times New Roman"/>
                 <w:b w:val="0"/>
-                <w:sz w:val="16"/>
+                <w:i w:val="0"/>
+                <w:sz w:val="18"/>
               </w:rPr>
               <w:t>Fividianana :</w:t>
             </w:r>
@@ -1650,7 +2116,8 @@
               <w:rPr>
                 <w:rFonts w:ascii="Times New Roman" w:hAnsi="Times New Roman"/>
                 <w:b w:val="0"/>
-                <w:sz w:val="16"/>
+                <w:i w:val="0"/>
+                <w:sz w:val="18"/>
               </w:rPr>
               <w:t>• Ciment</w:t>
             </w:r>
@@ -1664,7 +2131,8 @@
               <w:rPr>
                 <w:rFonts w:ascii="Times New Roman" w:hAnsi="Times New Roman"/>
                 <w:b w:val="0"/>
-                <w:sz w:val="16"/>
+                <w:i w:val="0"/>
+                <w:sz w:val="18"/>
               </w:rPr>
               <w:t>• Pointe 5,6,7,8</w:t>
             </w:r>
@@ -1678,7 +2146,8 @@
               <w:rPr>
                 <w:rFonts w:ascii="Times New Roman" w:hAnsi="Times New Roman"/>
                 <w:b w:val="0"/>
-                <w:sz w:val="16"/>
+                <w:i w:val="0"/>
+                <w:sz w:val="18"/>
               </w:rPr>
               <w:t>• Angady PM</w:t>
             </w:r>
@@ -1699,9 +2168,54 @@
               <w:rPr>
                 <w:rFonts w:ascii="Times New Roman" w:hAnsi="Times New Roman"/>
                 <w:b w:val="0"/>
-                <w:sz w:val="16"/>
-              </w:rPr>
-              <w:t>2 2 1</w:t>
+                <w:i w:val="0"/>
+                <w:sz w:val="18"/>
+              </w:rPr>
+            </w:r>
+          </w:p>
+          <w:p>
+            <w:pPr>
+              <w:spacing w:after="0" w:before="0"/>
+              <w:jc w:val="center"/>
+            </w:pPr>
+            <w:r>
+              <w:rPr>
+                <w:rFonts w:ascii="Times New Roman" w:hAnsi="Times New Roman"/>
+                <w:b w:val="0"/>
+                <w:i w:val="0"/>
+                <w:sz w:val="18"/>
+              </w:rPr>
+              <w:t>2</w:t>
+            </w:r>
+          </w:p>
+          <w:p>
+            <w:pPr>
+              <w:spacing w:after="0" w:before="0"/>
+              <w:jc w:val="center"/>
+            </w:pPr>
+            <w:r>
+              <w:rPr>
+                <w:rFonts w:ascii="Times New Roman" w:hAnsi="Times New Roman"/>
+                <w:b w:val="0"/>
+                <w:i w:val="0"/>
+                <w:sz w:val="18"/>
+              </w:rPr>
+              <w:t>2</w:t>
+            </w:r>
+          </w:p>
+          <w:p>
+            <w:pPr>
+              <w:spacing w:after="0" w:before="0"/>
+              <w:jc w:val="center"/>
+            </w:pPr>
+            <w:r>
+              <w:rPr>
+                <w:rFonts w:ascii="Times New Roman" w:hAnsi="Times New Roman"/>
+                <w:b w:val="0"/>
+                <w:i w:val="0"/>
+                <w:sz w:val="18"/>
+              </w:rPr>
+              <w:t>1</w:t>
             </w:r>
           </w:p>
         </w:tc>
@@ -1720,9 +2234,54 @@
               <w:rPr>
                 <w:rFonts w:ascii="Times New Roman" w:hAnsi="Times New Roman"/>
                 <w:b w:val="0"/>
-                <w:sz w:val="16"/>
-              </w:rPr>
-              <w:t>52 000 9 000 5 000</w:t>
+                <w:i w:val="0"/>
+                <w:sz w:val="18"/>
+              </w:rPr>
+            </w:r>
+          </w:p>
+          <w:p>
+            <w:pPr>
+              <w:spacing w:after="0" w:before="0"/>
+              <w:jc w:val="center"/>
+            </w:pPr>
+            <w:r>
+              <w:rPr>
+                <w:rFonts w:ascii="Times New Roman" w:hAnsi="Times New Roman"/>
+                <w:b w:val="0"/>
+                <w:i w:val="0"/>
+                <w:sz w:val="18"/>
+              </w:rPr>
+              <w:t>52 000</w:t>
+            </w:r>
+          </w:p>
+          <w:p>
+            <w:pPr>
+              <w:spacing w:after="0" w:before="0"/>
+              <w:jc w:val="center"/>
+            </w:pPr>
+            <w:r>
+              <w:rPr>
+                <w:rFonts w:ascii="Times New Roman" w:hAnsi="Times New Roman"/>
+                <w:b w:val="0"/>
+                <w:i w:val="0"/>
+                <w:sz w:val="18"/>
+              </w:rPr>
+              <w:t>9 000</w:t>
+            </w:r>
+          </w:p>
+          <w:p>
+            <w:pPr>
+              <w:spacing w:after="0" w:before="0"/>
+              <w:jc w:val="center"/>
+            </w:pPr>
+            <w:r>
+              <w:rPr>
+                <w:rFonts w:ascii="Times New Roman" w:hAnsi="Times New Roman"/>
+                <w:b w:val="0"/>
+                <w:i w:val="0"/>
+                <w:sz w:val="18"/>
+              </w:rPr>
+              <w:t>5 000</w:t>
             </w:r>
           </w:p>
         </w:tc>
@@ -1741,9 +2300,9 @@
               <w:rPr>
                 <w:rFonts w:ascii="Times New Roman" w:hAnsi="Times New Roman"/>
                 <w:b w:val="0"/>
-                <w:sz w:val="16"/>
-              </w:rPr>
-              <w:t>104 000 18 000 5 000</w:t>
+                <w:i w:val="0"/>
+                <w:sz w:val="18"/>
+              </w:rPr>
             </w:r>
           </w:p>
           <w:p>
@@ -1755,7 +2314,53 @@
               <w:rPr>
                 <w:rFonts w:ascii="Times New Roman" w:hAnsi="Times New Roman"/>
                 <w:b w:val="0"/>
-                <w:sz w:val="16"/>
+                <w:i w:val="0"/>
+                <w:sz w:val="18"/>
+              </w:rPr>
+              <w:t>104 000</w:t>
+            </w:r>
+          </w:p>
+          <w:p>
+            <w:pPr>
+              <w:spacing w:after="0" w:before="0"/>
+              <w:jc w:val="center"/>
+            </w:pPr>
+            <w:r>
+              <w:rPr>
+                <w:rFonts w:ascii="Times New Roman" w:hAnsi="Times New Roman"/>
+                <w:b w:val="0"/>
+                <w:i w:val="0"/>
+                <w:sz w:val="18"/>
+              </w:rPr>
+              <w:t>18 000</w:t>
+            </w:r>
+          </w:p>
+          <w:p>
+            <w:pPr>
+              <w:spacing w:after="0" w:before="0"/>
+              <w:jc w:val="center"/>
+            </w:pPr>
+            <w:r>
+              <w:rPr>
+                <w:rFonts w:ascii="Times New Roman" w:hAnsi="Times New Roman"/>
+                <w:b w:val="0"/>
+                <w:i w:val="0"/>
+                <w:sz w:val="18"/>
+              </w:rPr>
+              <w:t>5 000</w:t>
+            </w:r>
+          </w:p>
+          <w:p>
+            <w:pPr>
+              <w:spacing w:after="0" w:before="0"/>
+              <w:jc w:val="center"/>
+            </w:pPr>
+            <w:r>
+              <w:rPr>
+                <w:rFonts w:ascii="Times New Roman" w:hAnsi="Times New Roman"/>
+                <w:b/>
+                <w:i/>
+                <w:sz w:val="18"/>
               </w:rPr>
               <w:t>ST : 127 000</w:t>
             </w:r>
@@ -1776,6 +2381,7 @@
               <w:rPr>
                 <w:rFonts w:ascii="Times New Roman" w:hAnsi="Times New Roman"/>
                 <w:b w:val="0"/>
+                <w:i w:val="0"/>
                 <w:sz w:val="16"/>
               </w:rPr>
               <w:t>Caisse école : RPI (Etat)</w:t>
@@ -1797,6 +2403,7 @@
               <w:rPr>
                 <w:rFonts w:ascii="Times New Roman" w:hAnsi="Times New Roman"/>
                 <w:b w:val="0"/>
+                <w:i w:val="0"/>
                 <w:sz w:val="16"/>
               </w:rPr>
               <w:t>Ny Tale, Ny Filoha, Ny Trésorier</w:t>
@@ -1818,6 +2425,7 @@
               <w:rPr>
                 <w:rFonts w:ascii="Times New Roman" w:hAnsi="Times New Roman"/>
                 <w:b w:val="0"/>
+                <w:i w:val="0"/>
                 <w:sz w:val="16"/>
               </w:rPr>
               <w:t>Komity ray aman-dreny, Membre FEFFI</w:t>
@@ -1862,7 +2470,8 @@
               <w:rPr>
                 <w:rFonts w:ascii="Times New Roman" w:hAnsi="Times New Roman"/>
                 <w:b w:val="0"/>
-                <w:sz w:val="16"/>
+                <w:i w:val="0"/>
+                <w:sz w:val="18"/>
               </w:rPr>
               <w:t>• Ciment</w:t>
             </w:r>
@@ -1876,7 +2485,8 @@
               <w:rPr>
                 <w:rFonts w:ascii="Times New Roman" w:hAnsi="Times New Roman"/>
                 <w:b w:val="0"/>
-                <w:sz w:val="16"/>
+                <w:i w:val="0"/>
+                <w:sz w:val="18"/>
               </w:rPr>
               <w:t>• Angady GM</w:t>
             </w:r>
@@ -1890,7 +2500,8 @@
               <w:rPr>
                 <w:rFonts w:ascii="Times New Roman" w:hAnsi="Times New Roman"/>
                 <w:b w:val="0"/>
-                <w:sz w:val="16"/>
+                <w:i w:val="0"/>
+                <w:sz w:val="18"/>
               </w:rPr>
               <w:t>• Angady PM</w:t>
             </w:r>
@@ -1911,9 +2522,40 @@
               <w:rPr>
                 <w:rFonts w:ascii="Times New Roman" w:hAnsi="Times New Roman"/>
                 <w:b w:val="0"/>
-                <w:sz w:val="16"/>
-              </w:rPr>
-              <w:t>1 1 2</w:t>
+                <w:i w:val="0"/>
+                <w:sz w:val="18"/>
+              </w:rPr>
+              <w:t>1</w:t>
+            </w:r>
+          </w:p>
+          <w:p>
+            <w:pPr>
+              <w:spacing w:after="0" w:before="0"/>
+              <w:jc w:val="center"/>
+            </w:pPr>
+            <w:r>
+              <w:rPr>
+                <w:rFonts w:ascii="Times New Roman" w:hAnsi="Times New Roman"/>
+                <w:b w:val="0"/>
+                <w:i w:val="0"/>
+                <w:sz w:val="18"/>
+              </w:rPr>
+              <w:t>1</w:t>
+            </w:r>
+          </w:p>
+          <w:p>
+            <w:pPr>
+              <w:spacing w:after="0" w:before="0"/>
+              <w:jc w:val="center"/>
+            </w:pPr>
+            <w:r>
+              <w:rPr>
+                <w:rFonts w:ascii="Times New Roman" w:hAnsi="Times New Roman"/>
+                <w:b w:val="0"/>
+                <w:i w:val="0"/>
+                <w:sz w:val="18"/>
+              </w:rPr>
+              <w:t>2</w:t>
             </w:r>
           </w:p>
         </w:tc>
@@ -1932,9 +2574,40 @@
               <w:rPr>
                 <w:rFonts w:ascii="Times New Roman" w:hAnsi="Times New Roman"/>
                 <w:b w:val="0"/>
-                <w:sz w:val="16"/>
-              </w:rPr>
-              <w:t>52 000 16 000 5 000</w:t>
+                <w:i w:val="0"/>
+                <w:sz w:val="18"/>
+              </w:rPr>
+              <w:t>52 000</w:t>
+            </w:r>
+          </w:p>
+          <w:p>
+            <w:pPr>
+              <w:spacing w:after="0" w:before="0"/>
+              <w:jc w:val="center"/>
+            </w:pPr>
+            <w:r>
+              <w:rPr>
+                <w:rFonts w:ascii="Times New Roman" w:hAnsi="Times New Roman"/>
+                <w:b w:val="0"/>
+                <w:i w:val="0"/>
+                <w:sz w:val="18"/>
+              </w:rPr>
+              <w:t>16 000</w:t>
+            </w:r>
+          </w:p>
+          <w:p>
+            <w:pPr>
+              <w:spacing w:after="0" w:before="0"/>
+              <w:jc w:val="center"/>
+            </w:pPr>
+            <w:r>
+              <w:rPr>
+                <w:rFonts w:ascii="Times New Roman" w:hAnsi="Times New Roman"/>
+                <w:b w:val="0"/>
+                <w:i w:val="0"/>
+                <w:sz w:val="18"/>
+              </w:rPr>
+              <w:t>5 000</w:t>
             </w:r>
           </w:p>
         </w:tc>
@@ -1953,9 +2626,10 @@
               <w:rPr>
                 <w:rFonts w:ascii="Times New Roman" w:hAnsi="Times New Roman"/>
                 <w:b w:val="0"/>
-                <w:sz w:val="16"/>
-              </w:rPr>
-              <w:t>52 000 16 000 10 000</w:t>
+                <w:i w:val="0"/>
+                <w:sz w:val="18"/>
+              </w:rPr>
+              <w:t>52 000</w:t>
             </w:r>
           </w:p>
           <w:p>
@@ -1967,7 +2641,38 @@
               <w:rPr>
                 <w:rFonts w:ascii="Times New Roman" w:hAnsi="Times New Roman"/>
                 <w:b w:val="0"/>
-                <w:sz w:val="16"/>
+                <w:i w:val="0"/>
+                <w:sz w:val="18"/>
+              </w:rPr>
+              <w:t>16 000</w:t>
+            </w:r>
+          </w:p>
+          <w:p>
+            <w:pPr>
+              <w:spacing w:after="0" w:before="0"/>
+              <w:jc w:val="center"/>
+            </w:pPr>
+            <w:r>
+              <w:rPr>
+                <w:rFonts w:ascii="Times New Roman" w:hAnsi="Times New Roman"/>
+                <w:b w:val="0"/>
+                <w:i w:val="0"/>
+                <w:sz w:val="18"/>
+              </w:rPr>
+              <w:t>10 000</w:t>
+            </w:r>
+          </w:p>
+          <w:p>
+            <w:pPr>
+              <w:spacing w:after="0" w:before="0"/>
+              <w:jc w:val="center"/>
+            </w:pPr>
+            <w:r>
+              <w:rPr>
+                <w:rFonts w:ascii="Times New Roman" w:hAnsi="Times New Roman"/>
+                <w:b/>
+                <w:i/>
+                <w:sz w:val="18"/>
               </w:rPr>
               <w:t>ST : 78 000</w:t>
             </w:r>
@@ -1988,6 +2693,7 @@
               <w:rPr>
                 <w:rFonts w:ascii="Times New Roman" w:hAnsi="Times New Roman"/>
                 <w:b w:val="0"/>
+                <w:i w:val="0"/>
                 <w:sz w:val="16"/>
               </w:rPr>
               <w:t>Caisse école : FCE</w:t>
@@ -2009,6 +2715,7 @@
               <w:rPr>
                 <w:rFonts w:ascii="Times New Roman" w:hAnsi="Times New Roman"/>
                 <w:b w:val="0"/>
+                <w:i w:val="0"/>
                 <w:sz w:val="16"/>
               </w:rPr>
               <w:t>–</w:t>
@@ -2030,6 +2737,7 @@
               <w:rPr>
                 <w:rFonts w:ascii="Times New Roman" w:hAnsi="Times New Roman"/>
                 <w:b w:val="0"/>
+                <w:i w:val="0"/>
                 <w:sz w:val="16"/>
               </w:rPr>
               <w:t>–</w:t>
@@ -2074,7 +2782,8 @@
               <w:rPr>
                 <w:rFonts w:ascii="Times New Roman" w:hAnsi="Times New Roman"/>
                 <w:b w:val="0"/>
-                <w:sz w:val="16"/>
+                <w:i w:val="0"/>
+                <w:sz w:val="18"/>
               </w:rPr>
               <w:t>• Andry</w:t>
             </w:r>
@@ -2088,7 +2797,8 @@
               <w:rPr>
                 <w:rFonts w:ascii="Times New Roman" w:hAnsi="Times New Roman"/>
                 <w:b w:val="0"/>
-                <w:sz w:val="16"/>
+                <w:i w:val="0"/>
+                <w:sz w:val="18"/>
               </w:rPr>
               <w:t>• Chevron</w:t>
             </w:r>
@@ -2102,7 +2812,8 @@
               <w:rPr>
                 <w:rFonts w:ascii="Times New Roman" w:hAnsi="Times New Roman"/>
                 <w:b w:val="0"/>
-                <w:sz w:val="16"/>
+                <w:i w:val="0"/>
+                <w:sz w:val="18"/>
               </w:rPr>
               <w:t>• Tôle 2,50</w:t>
             </w:r>
@@ -2116,7 +2827,8 @@
               <w:rPr>
                 <w:rFonts w:ascii="Times New Roman" w:hAnsi="Times New Roman"/>
                 <w:b w:val="0"/>
-                <w:sz w:val="16"/>
+                <w:i w:val="0"/>
+                <w:sz w:val="18"/>
               </w:rPr>
               <w:t>• Pointe tôle</w:t>
             </w:r>
@@ -2137,9 +2849,55 @@
               <w:rPr>
                 <w:rFonts w:ascii="Times New Roman" w:hAnsi="Times New Roman"/>
                 <w:b w:val="0"/>
-                <w:sz w:val="16"/>
-              </w:rPr>
-              <w:t>60 45 30 3</w:t>
+                <w:i w:val="0"/>
+                <w:sz w:val="18"/>
+              </w:rPr>
+              <w:t>60</w:t>
+            </w:r>
+          </w:p>
+          <w:p>
+            <w:pPr>
+              <w:spacing w:after="0" w:before="0"/>
+              <w:jc w:val="center"/>
+            </w:pPr>
+            <w:r>
+              <w:rPr>
+                <w:rFonts w:ascii="Times New Roman" w:hAnsi="Times New Roman"/>
+                <w:b w:val="0"/>
+                <w:i w:val="0"/>
+                <w:sz w:val="18"/>
+              </w:rPr>
+              <w:t>45</w:t>
+            </w:r>
+          </w:p>
+          <w:p>
+            <w:pPr>
+              <w:spacing w:after="0" w:before="0"/>
+              <w:jc w:val="center"/>
+            </w:pPr>
+            <w:r>
+              <w:rPr>
+                <w:rFonts w:ascii="Times New Roman" w:hAnsi="Times New Roman"/>
+                <w:b w:val="0"/>
+                <w:i w:val="0"/>
+                <w:sz w:val="18"/>
+              </w:rPr>
+              <w:t>30</w:t>
+            </w:r>
+          </w:p>
+          <w:p>
+            <w:pPr>
+              <w:spacing w:after="0" w:before="0"/>
+              <w:jc w:val="center"/>
+            </w:pPr>
+            <w:r>
+              <w:rPr>
+                <w:rFonts w:ascii="Times New Roman" w:hAnsi="Times New Roman"/>
+                <w:b w:val="0"/>
+                <w:i w:val="0"/>
+                <w:sz w:val="18"/>
+              </w:rPr>
+              <w:t>3</w:t>
             </w:r>
           </w:p>
         </w:tc>
@@ -2158,9 +2916,55 @@
               <w:rPr>
                 <w:rFonts w:ascii="Times New Roman" w:hAnsi="Times New Roman"/>
                 <w:b w:val="0"/>
-                <w:sz w:val="16"/>
-              </w:rPr>
-              <w:t>6 000 6 000 40 000 9 000</w:t>
+                <w:i w:val="0"/>
+                <w:sz w:val="18"/>
+              </w:rPr>
+              <w:t>6 000</w:t>
+            </w:r>
+          </w:p>
+          <w:p>
+            <w:pPr>
+              <w:spacing w:after="0" w:before="0"/>
+              <w:jc w:val="center"/>
+            </w:pPr>
+            <w:r>
+              <w:rPr>
+                <w:rFonts w:ascii="Times New Roman" w:hAnsi="Times New Roman"/>
+                <w:b w:val="0"/>
+                <w:i w:val="0"/>
+                <w:sz w:val="18"/>
+              </w:rPr>
+              <w:t>6 000</w:t>
+            </w:r>
+          </w:p>
+          <w:p>
+            <w:pPr>
+              <w:spacing w:after="0" w:before="0"/>
+              <w:jc w:val="center"/>
+            </w:pPr>
+            <w:r>
+              <w:rPr>
+                <w:rFonts w:ascii="Times New Roman" w:hAnsi="Times New Roman"/>
+                <w:b w:val="0"/>
+                <w:i w:val="0"/>
+                <w:sz w:val="18"/>
+              </w:rPr>
+              <w:t>40 000</w:t>
+            </w:r>
+          </w:p>
+          <w:p>
+            <w:pPr>
+              <w:spacing w:after="0" w:before="0"/>
+              <w:jc w:val="center"/>
+            </w:pPr>
+            <w:r>
+              <w:rPr>
+                <w:rFonts w:ascii="Times New Roman" w:hAnsi="Times New Roman"/>
+                <w:b w:val="0"/>
+                <w:i w:val="0"/>
+                <w:sz w:val="18"/>
+              </w:rPr>
+              <w:t>9 000</w:t>
             </w:r>
           </w:p>
         </w:tc>
@@ -2179,9 +2983,10 @@
               <w:rPr>
                 <w:rFonts w:ascii="Times New Roman" w:hAnsi="Times New Roman"/>
                 <w:b w:val="0"/>
-                <w:sz w:val="16"/>
-              </w:rPr>
-              <w:t>360 000 270 000 1 200 000 27 000</w:t>
+                <w:i w:val="0"/>
+                <w:sz w:val="18"/>
+              </w:rPr>
+              <w:t>360 000</w:t>
             </w:r>
           </w:p>
           <w:p>
@@ -2193,7 +2998,53 @@
               <w:rPr>
                 <w:rFonts w:ascii="Times New Roman" w:hAnsi="Times New Roman"/>
                 <w:b w:val="0"/>
-                <w:sz w:val="16"/>
+                <w:i w:val="0"/>
+                <w:sz w:val="18"/>
+              </w:rPr>
+              <w:t>270 000</w:t>
+            </w:r>
+          </w:p>
+          <w:p>
+            <w:pPr>
+              <w:spacing w:after="0" w:before="0"/>
+              <w:jc w:val="center"/>
+            </w:pPr>
+            <w:r>
+              <w:rPr>
+                <w:rFonts w:ascii="Times New Roman" w:hAnsi="Times New Roman"/>
+                <w:b w:val="0"/>
+                <w:i w:val="0"/>
+                <w:sz w:val="18"/>
+              </w:rPr>
+              <w:t>1 200 000</w:t>
+            </w:r>
+          </w:p>
+          <w:p>
+            <w:pPr>
+              <w:spacing w:after="0" w:before="0"/>
+              <w:jc w:val="center"/>
+            </w:pPr>
+            <w:r>
+              <w:rPr>
+                <w:rFonts w:ascii="Times New Roman" w:hAnsi="Times New Roman"/>
+                <w:b w:val="0"/>
+                <w:i w:val="0"/>
+                <w:sz w:val="18"/>
+              </w:rPr>
+              <w:t>27 000</w:t>
+            </w:r>
+          </w:p>
+          <w:p>
+            <w:pPr>
+              <w:spacing w:after="0" w:before="0"/>
+              <w:jc w:val="center"/>
+            </w:pPr>
+            <w:r>
+              <w:rPr>
+                <w:rFonts w:ascii="Times New Roman" w:hAnsi="Times New Roman"/>
+                <w:b/>
+                <w:i/>
+                <w:sz w:val="18"/>
               </w:rPr>
               <w:t>ST : 1 857 000</w:t>
             </w:r>
@@ -2214,6 +3065,7 @@
               <w:rPr>
                 <w:rFonts w:ascii="Times New Roman" w:hAnsi="Times New Roman"/>
                 <w:b w:val="0"/>
+                <w:i w:val="0"/>
                 <w:sz w:val="16"/>
               </w:rPr>
               <w:t>VOI</w:t>
@@ -2235,6 +3087,7 @@
               <w:rPr>
                 <w:rFonts w:ascii="Times New Roman" w:hAnsi="Times New Roman"/>
                 <w:b w:val="0"/>
+                <w:i w:val="0"/>
                 <w:sz w:val="16"/>
               </w:rPr>
               <w:t>VOI</w:t>
@@ -2256,6 +3109,7 @@
               <w:rPr>
                 <w:rFonts w:ascii="Times New Roman" w:hAnsi="Times New Roman"/>
                 <w:b w:val="0"/>
+                <w:i w:val="0"/>
                 <w:sz w:val="16"/>
               </w:rPr>
               <w:t>VOI</w:t>
@@ -2287,6 +3141,7 @@
               <w:rPr>
                 <w:rFonts w:ascii="Times New Roman" w:hAnsi="Times New Roman"/>
                 <w:b w:val="0"/>
+                <w:i w:val="0"/>
                 <w:sz w:val="16"/>
               </w:rPr>
               <w:t>Fividianana fitaovana ho an’ny mpampianatra (côte bureau)</w:t>
@@ -2309,6 +3164,7 @@
               <w:rPr>
                 <w:rFonts w:ascii="Times New Roman" w:hAnsi="Times New Roman"/>
                 <w:b w:val="0"/>
+                <w:i w:val="0"/>
                 <w:sz w:val="16"/>
               </w:rPr>
               <w:t>Septambra – Desambra 2026</w:t>
@@ -2330,7 +3186,8 @@
               <w:rPr>
                 <w:rFonts w:ascii="Times New Roman" w:hAnsi="Times New Roman"/>
                 <w:b w:val="0"/>
-                <w:sz w:val="16"/>
+                <w:i w:val="0"/>
+                <w:sz w:val="18"/>
               </w:rPr>
               <w:t>Fividianana :</w:t>
             </w:r>
@@ -2344,7 +3201,8 @@
               <w:rPr>
                 <w:rFonts w:ascii="Times New Roman" w:hAnsi="Times New Roman"/>
                 <w:b w:val="0"/>
-                <w:sz w:val="16"/>
+                <w:i w:val="0"/>
+                <w:sz w:val="18"/>
               </w:rPr>
               <w:t>• Colle bureau</w:t>
             </w:r>
@@ -2358,7 +3216,8 @@
               <w:rPr>
                 <w:rFonts w:ascii="Times New Roman" w:hAnsi="Times New Roman"/>
                 <w:b w:val="0"/>
-                <w:sz w:val="16"/>
+                <w:i w:val="0"/>
+                <w:sz w:val="18"/>
               </w:rPr>
               <w:t>• Wood Fix 500 g</w:t>
             </w:r>
@@ -2372,7 +3231,8 @@
               <w:rPr>
                 <w:rFonts w:ascii="Times New Roman" w:hAnsi="Times New Roman"/>
                 <w:b w:val="0"/>
-                <w:sz w:val="16"/>
+                <w:i w:val="0"/>
+                <w:sz w:val="18"/>
               </w:rPr>
               <w:t>• Cahier GF 200p lux</w:t>
             </w:r>
@@ -2386,7 +3246,8 @@
               <w:rPr>
                 <w:rFonts w:ascii="Times New Roman" w:hAnsi="Times New Roman"/>
                 <w:b w:val="0"/>
-                <w:sz w:val="16"/>
+                <w:i w:val="0"/>
+                <w:sz w:val="18"/>
               </w:rPr>
               <w:t>• Cahier PF 200p lux</w:t>
             </w:r>
@@ -2400,7 +3261,8 @@
               <w:rPr>
                 <w:rFonts w:ascii="Times New Roman" w:hAnsi="Times New Roman"/>
                 <w:b w:val="0"/>
-                <w:sz w:val="16"/>
+                <w:i w:val="0"/>
+                <w:sz w:val="18"/>
               </w:rPr>
               <w:t>• Chemise à dossier</w:t>
             </w:r>
@@ -2414,7 +3276,8 @@
               <w:rPr>
                 <w:rFonts w:ascii="Times New Roman" w:hAnsi="Times New Roman"/>
                 <w:b w:val="0"/>
-                <w:sz w:val="16"/>
+                <w:i w:val="0"/>
+                <w:sz w:val="18"/>
               </w:rPr>
               <w:t>• Ciseaux PM</w:t>
             </w:r>
@@ -2428,7 +3291,8 @@
               <w:rPr>
                 <w:rFonts w:ascii="Times New Roman" w:hAnsi="Times New Roman"/>
                 <w:b w:val="0"/>
-                <w:sz w:val="16"/>
+                <w:i w:val="0"/>
+                <w:sz w:val="18"/>
               </w:rPr>
               <w:t>• Enveloppe A4 Kraft</w:t>
             </w:r>
@@ -2442,7 +3306,8 @@
               <w:rPr>
                 <w:rFonts w:ascii="Times New Roman" w:hAnsi="Times New Roman"/>
                 <w:b w:val="0"/>
-                <w:sz w:val="16"/>
+                <w:i w:val="0"/>
+                <w:sz w:val="18"/>
               </w:rPr>
               <w:t>• Marker Dollar 6 BL/ER</w:t>
             </w:r>
@@ -2456,7 +3321,8 @@
               <w:rPr>
                 <w:rFonts w:ascii="Times New Roman" w:hAnsi="Times New Roman"/>
                 <w:b w:val="0"/>
-                <w:sz w:val="16"/>
+                <w:i w:val="0"/>
+                <w:sz w:val="18"/>
               </w:rPr>
               <w:t>• Papier Velin ram</w:t>
             </w:r>
@@ -2470,7 +3336,8 @@
               <w:rPr>
                 <w:rFonts w:ascii="Times New Roman" w:hAnsi="Times New Roman"/>
                 <w:b w:val="0"/>
-                <w:sz w:val="16"/>
+                <w:i w:val="0"/>
+                <w:sz w:val="18"/>
               </w:rPr>
               <w:t>• Pinceau N°3</w:t>
             </w:r>
@@ -2484,7 +3351,8 @@
               <w:rPr>
                 <w:rFonts w:ascii="Times New Roman" w:hAnsi="Times New Roman"/>
                 <w:b w:val="0"/>
-                <w:sz w:val="16"/>
+                <w:i w:val="0"/>
+                <w:sz w:val="18"/>
               </w:rPr>
               <w:t>• Rateau</w:t>
             </w:r>
@@ -2498,7 +3366,8 @@
               <w:rPr>
                 <w:rFonts w:ascii="Times New Roman" w:hAnsi="Times New Roman"/>
                 <w:b w:val="0"/>
-                <w:sz w:val="16"/>
+                <w:i w:val="0"/>
+                <w:sz w:val="18"/>
               </w:rPr>
               <w:t>• Règle pour TN</w:t>
             </w:r>
@@ -2512,7 +3381,8 @@
               <w:rPr>
                 <w:rFonts w:ascii="Times New Roman" w:hAnsi="Times New Roman"/>
                 <w:b w:val="0"/>
-                <w:sz w:val="16"/>
+                <w:i w:val="0"/>
+                <w:sz w:val="18"/>
               </w:rPr>
               <w:t>• Stylo Digno R/N/B (6×3)</w:t>
             </w:r>
@@ -2526,7 +3396,8 @@
               <w:rPr>
                 <w:rFonts w:ascii="Times New Roman" w:hAnsi="Times New Roman"/>
                 <w:b w:val="0"/>
-                <w:sz w:val="16"/>
+                <w:i w:val="0"/>
+                <w:sz w:val="18"/>
               </w:rPr>
               <w:t>• Stylo Schneider Bleu</w:t>
             </w:r>
@@ -2540,7 +3411,8 @@
               <w:rPr>
                 <w:rFonts w:ascii="Times New Roman" w:hAnsi="Times New Roman"/>
                 <w:b w:val="0"/>
-                <w:sz w:val="16"/>
+                <w:i w:val="0"/>
+                <w:sz w:val="18"/>
               </w:rPr>
               <w:t>• Stylo Schneider Rouge</w:t>
             </w:r>
@@ -2554,7 +3426,8 @@
               <w:rPr>
                 <w:rFonts w:ascii="Times New Roman" w:hAnsi="Times New Roman"/>
                 <w:b w:val="0"/>
-                <w:sz w:val="16"/>
+                <w:i w:val="0"/>
+                <w:sz w:val="18"/>
               </w:rPr>
               <w:t>• Stylo Schneider Noir</w:t>
             </w:r>
@@ -2568,7 +3441,8 @@
               <w:rPr>
                 <w:rFonts w:ascii="Times New Roman" w:hAnsi="Times New Roman"/>
                 <w:b w:val="0"/>
-                <w:sz w:val="16"/>
+                <w:i w:val="0"/>
+                <w:sz w:val="18"/>
               </w:rPr>
               <w:t>• Stylo Schneider Vert</w:t>
             </w:r>
@@ -2582,7 +3456,8 @@
               <w:rPr>
                 <w:rFonts w:ascii="Times New Roman" w:hAnsi="Times New Roman"/>
                 <w:b w:val="0"/>
-                <w:sz w:val="16"/>
+                <w:i w:val="0"/>
+                <w:sz w:val="18"/>
               </w:rPr>
               <w:t>• Scotch GM</w:t>
             </w:r>
@@ -2596,7 +3471,8 @@
               <w:rPr>
                 <w:rFonts w:ascii="Times New Roman" w:hAnsi="Times New Roman"/>
                 <w:b w:val="0"/>
-                <w:sz w:val="16"/>
+                <w:i w:val="0"/>
+                <w:sz w:val="18"/>
               </w:rPr>
               <w:t>• Tadin-tsaina</w:t>
             </w:r>
@@ -2610,7 +3486,8 @@
               <w:rPr>
                 <w:rFonts w:ascii="Times New Roman" w:hAnsi="Times New Roman"/>
                 <w:b w:val="0"/>
-                <w:sz w:val="16"/>
+                <w:i w:val="0"/>
+                <w:sz w:val="18"/>
               </w:rPr>
               <w:t>• Emballage blanc</w:t>
             </w:r>
@@ -2624,7 +3501,8 @@
               <w:rPr>
                 <w:rFonts w:ascii="Times New Roman" w:hAnsi="Times New Roman"/>
                 <w:b w:val="0"/>
-                <w:sz w:val="16"/>
+                <w:i w:val="0"/>
+                <w:sz w:val="18"/>
               </w:rPr>
               <w:t>• Badge</w:t>
             </w:r>
@@ -2638,7 +3516,8 @@
               <w:rPr>
                 <w:rFonts w:ascii="Times New Roman" w:hAnsi="Times New Roman"/>
                 <w:b w:val="0"/>
-                <w:sz w:val="16"/>
+                <w:i w:val="0"/>
+                <w:sz w:val="18"/>
               </w:rPr>
               <w:t>• Porte feuille</w:t>
             </w:r>
@@ -2652,7 +3531,8 @@
               <w:rPr>
                 <w:rFonts w:ascii="Times New Roman" w:hAnsi="Times New Roman"/>
                 <w:b w:val="0"/>
-                <w:sz w:val="16"/>
+                <w:i w:val="0"/>
+                <w:sz w:val="18"/>
               </w:rPr>
               <w:t>• Registre d’appel GM</w:t>
             </w:r>
@@ -2673,9 +3553,354 @@
               <w:rPr>
                 <w:rFonts w:ascii="Times New Roman" w:hAnsi="Times New Roman"/>
                 <w:b w:val="0"/>
-                <w:sz w:val="16"/>
-              </w:rPr>
-              <w:t>6 1 14 12 60 6 18 12 2 2 1 1 18 18 18 18 6 6 24 36 1 12 7</w:t>
+                <w:i w:val="0"/>
+                <w:sz w:val="18"/>
+              </w:rPr>
+            </w:r>
+          </w:p>
+          <w:p>
+            <w:pPr>
+              <w:spacing w:after="0" w:before="0"/>
+              <w:jc w:val="center"/>
+            </w:pPr>
+            <w:r>
+              <w:rPr>
+                <w:rFonts w:ascii="Times New Roman" w:hAnsi="Times New Roman"/>
+                <w:b w:val="0"/>
+                <w:i w:val="0"/>
+                <w:sz w:val="18"/>
+              </w:rPr>
+              <w:t>6</w:t>
+            </w:r>
+          </w:p>
+          <w:p>
+            <w:pPr>
+              <w:spacing w:after="0" w:before="0"/>
+              <w:jc w:val="center"/>
+            </w:pPr>
+            <w:r>
+              <w:rPr>
+                <w:rFonts w:ascii="Times New Roman" w:hAnsi="Times New Roman"/>
+                <w:b w:val="0"/>
+                <w:i w:val="0"/>
+                <w:sz w:val="18"/>
+              </w:rPr>
+              <w:t>1</w:t>
+            </w:r>
+          </w:p>
+          <w:p>
+            <w:pPr>
+              <w:spacing w:after="0" w:before="0"/>
+              <w:jc w:val="center"/>
+            </w:pPr>
+            <w:r>
+              <w:rPr>
+                <w:rFonts w:ascii="Times New Roman" w:hAnsi="Times New Roman"/>
+                <w:b w:val="0"/>
+                <w:i w:val="0"/>
+                <w:sz w:val="18"/>
+              </w:rPr>
+              <w:t>14</w:t>
+            </w:r>
+          </w:p>
+          <w:p>
+            <w:pPr>
+              <w:spacing w:after="0" w:before="0"/>
+              <w:jc w:val="center"/>
+            </w:pPr>
+            <w:r>
+              <w:rPr>
+                <w:rFonts w:ascii="Times New Roman" w:hAnsi="Times New Roman"/>
+                <w:b w:val="0"/>
+                <w:i w:val="0"/>
+                <w:sz w:val="18"/>
+              </w:rPr>
+              <w:t>12</w:t>
+            </w:r>
+          </w:p>
+          <w:p>
+            <w:pPr>
+              <w:spacing w:after="0" w:before="0"/>
+              <w:jc w:val="center"/>
+            </w:pPr>
+            <w:r>
+              <w:rPr>
+                <w:rFonts w:ascii="Times New Roman" w:hAnsi="Times New Roman"/>
+                <w:b w:val="0"/>
+                <w:i w:val="0"/>
+                <w:sz w:val="18"/>
+              </w:rPr>
+              <w:t>60</w:t>
+            </w:r>
+          </w:p>
+          <w:p>
+            <w:pPr>
+              <w:spacing w:after="0" w:before="0"/>
+              <w:jc w:val="center"/>
+            </w:pPr>
+            <w:r>
+              <w:rPr>
+                <w:rFonts w:ascii="Times New Roman" w:hAnsi="Times New Roman"/>
+                <w:b w:val="0"/>
+                <w:i w:val="0"/>
+                <w:sz w:val="18"/>
+              </w:rPr>
+              <w:t>6</w:t>
+            </w:r>
+          </w:p>
+          <w:p>
+            <w:pPr>
+              <w:spacing w:after="0" w:before="0"/>
+              <w:jc w:val="center"/>
+            </w:pPr>
+            <w:r>
+              <w:rPr>
+                <w:rFonts w:ascii="Times New Roman" w:hAnsi="Times New Roman"/>
+                <w:b w:val="0"/>
+                <w:i w:val="0"/>
+                <w:sz w:val="18"/>
+              </w:rPr>
+              <w:t>18</w:t>
+            </w:r>
+          </w:p>
+          <w:p>
+            <w:pPr>
+              <w:spacing w:after="0" w:before="0"/>
+              <w:jc w:val="center"/>
+            </w:pPr>
+            <w:r>
+              <w:rPr>
+                <w:rFonts w:ascii="Times New Roman" w:hAnsi="Times New Roman"/>
+                <w:b w:val="0"/>
+                <w:i w:val="0"/>
+                <w:sz w:val="18"/>
+              </w:rPr>
+              <w:t>12</w:t>
+            </w:r>
+          </w:p>
+          <w:p>
+            <w:pPr>
+              <w:spacing w:after="0" w:before="0"/>
+              <w:jc w:val="center"/>
+            </w:pPr>
+            <w:r>
+              <w:rPr>
+                <w:rFonts w:ascii="Times New Roman" w:hAnsi="Times New Roman"/>
+                <w:b w:val="0"/>
+                <w:i w:val="0"/>
+                <w:sz w:val="18"/>
+              </w:rPr>
+              <w:t>2</w:t>
+            </w:r>
+          </w:p>
+          <w:p>
+            <w:pPr>
+              <w:spacing w:after="0" w:before="0"/>
+              <w:jc w:val="center"/>
+            </w:pPr>
+            <w:r>
+              <w:rPr>
+                <w:rFonts w:ascii="Times New Roman" w:hAnsi="Times New Roman"/>
+                <w:b w:val="0"/>
+                <w:i w:val="0"/>
+                <w:sz w:val="18"/>
+              </w:rPr>
+              <w:t>2</w:t>
+            </w:r>
+          </w:p>
+          <w:p>
+            <w:pPr>
+              <w:spacing w:after="0" w:before="0"/>
+              <w:jc w:val="center"/>
+            </w:pPr>
+            <w:r>
+              <w:rPr>
+                <w:rFonts w:ascii="Times New Roman" w:hAnsi="Times New Roman"/>
+                <w:b w:val="0"/>
+                <w:i w:val="0"/>
+                <w:sz w:val="18"/>
+              </w:rPr>
+              <w:t>1</w:t>
+            </w:r>
+          </w:p>
+          <w:p>
+            <w:pPr>
+              <w:spacing w:after="0" w:before="0"/>
+              <w:jc w:val="center"/>
+            </w:pPr>
+            <w:r>
+              <w:rPr>
+                <w:rFonts w:ascii="Times New Roman" w:hAnsi="Times New Roman"/>
+                <w:b w:val="0"/>
+                <w:i w:val="0"/>
+                <w:sz w:val="18"/>
+              </w:rPr>
+              <w:t>1</w:t>
+            </w:r>
+          </w:p>
+          <w:p>
+            <w:pPr>
+              <w:spacing w:after="0" w:before="0"/>
+              <w:jc w:val="center"/>
+            </w:pPr>
+            <w:r>
+              <w:rPr>
+                <w:rFonts w:ascii="Times New Roman" w:hAnsi="Times New Roman"/>
+                <w:b w:val="0"/>
+                <w:i w:val="0"/>
+                <w:sz w:val="18"/>
+              </w:rPr>
+              <w:t>18</w:t>
+            </w:r>
+          </w:p>
+          <w:p>
+            <w:pPr>
+              <w:spacing w:after="0" w:before="0"/>
+              <w:jc w:val="center"/>
+            </w:pPr>
+            <w:r>
+              <w:rPr>
+                <w:rFonts w:ascii="Times New Roman" w:hAnsi="Times New Roman"/>
+                <w:b w:val="0"/>
+                <w:i w:val="0"/>
+                <w:sz w:val="18"/>
+              </w:rPr>
+              <w:t>18</w:t>
+            </w:r>
+          </w:p>
+          <w:p>
+            <w:pPr>
+              <w:spacing w:after="0" w:before="0"/>
+              <w:jc w:val="center"/>
+            </w:pPr>
+            <w:r>
+              <w:rPr>
+                <w:rFonts w:ascii="Times New Roman" w:hAnsi="Times New Roman"/>
+                <w:b w:val="0"/>
+                <w:i w:val="0"/>
+                <w:sz w:val="18"/>
+              </w:rPr>
+              <w:t>18</w:t>
+            </w:r>
+          </w:p>
+          <w:p>
+            <w:pPr>
+              <w:spacing w:after="0" w:before="0"/>
+              <w:jc w:val="center"/>
+            </w:pPr>
+            <w:r>
+              <w:rPr>
+                <w:rFonts w:ascii="Times New Roman" w:hAnsi="Times New Roman"/>
+                <w:b w:val="0"/>
+                <w:i w:val="0"/>
+                <w:sz w:val="18"/>
+              </w:rPr>
+              <w:t>18</w:t>
+            </w:r>
+          </w:p>
+          <w:p>
+            <w:pPr>
+              <w:spacing w:after="0" w:before="0"/>
+              <w:jc w:val="center"/>
+            </w:pPr>
+            <w:r>
+              <w:rPr>
+                <w:rFonts w:ascii="Times New Roman" w:hAnsi="Times New Roman"/>
+                <w:b w:val="0"/>
+                <w:i w:val="0"/>
+                <w:sz w:val="18"/>
+              </w:rPr>
+              <w:t>6</w:t>
+            </w:r>
+          </w:p>
+          <w:p>
+            <w:pPr>
+              <w:spacing w:after="0" w:before="0"/>
+              <w:jc w:val="center"/>
+            </w:pPr>
+            <w:r>
+              <w:rPr>
+                <w:rFonts w:ascii="Times New Roman" w:hAnsi="Times New Roman"/>
+                <w:b w:val="0"/>
+                <w:i w:val="0"/>
+                <w:sz w:val="18"/>
+              </w:rPr>
+              <w:t>6</w:t>
+            </w:r>
+          </w:p>
+          <w:p>
+            <w:pPr>
+              <w:spacing w:after="0" w:before="0"/>
+              <w:jc w:val="center"/>
+            </w:pPr>
+            <w:r>
+              <w:rPr>
+                <w:rFonts w:ascii="Times New Roman" w:hAnsi="Times New Roman"/>
+                <w:b w:val="0"/>
+                <w:i w:val="0"/>
+                <w:sz w:val="18"/>
+              </w:rPr>
+              <w:t>24</w:t>
+            </w:r>
+          </w:p>
+          <w:p>
+            <w:pPr>
+              <w:spacing w:after="0" w:before="0"/>
+              <w:jc w:val="center"/>
+            </w:pPr>
+            <w:r>
+              <w:rPr>
+                <w:rFonts w:ascii="Times New Roman" w:hAnsi="Times New Roman"/>
+                <w:b w:val="0"/>
+                <w:i w:val="0"/>
+                <w:sz w:val="18"/>
+              </w:rPr>
+              <w:t>36</w:t>
+            </w:r>
+          </w:p>
+          <w:p>
+            <w:pPr>
+              <w:spacing w:after="0" w:before="0"/>
+              <w:jc w:val="center"/>
+            </w:pPr>
+            <w:r>
+              <w:rPr>
+                <w:rFonts w:ascii="Times New Roman" w:hAnsi="Times New Roman"/>
+                <w:b w:val="0"/>
+                <w:i w:val="0"/>
+                <w:sz w:val="18"/>
+              </w:rPr>
+              <w:t>1</w:t>
+            </w:r>
+          </w:p>
+          <w:p>
+            <w:pPr>
+              <w:spacing w:after="0" w:before="0"/>
+              <w:jc w:val="center"/>
+            </w:pPr>
+            <w:r>
+              <w:rPr>
+                <w:rFonts w:ascii="Times New Roman" w:hAnsi="Times New Roman"/>
+                <w:b w:val="0"/>
+                <w:i w:val="0"/>
+                <w:sz w:val="18"/>
+              </w:rPr>
+              <w:t>12</w:t>
+            </w:r>
+          </w:p>
+          <w:p>
+            <w:pPr>
+              <w:spacing w:after="0" w:before="0"/>
+              <w:jc w:val="center"/>
+            </w:pPr>
+            <w:r>
+              <w:rPr>
+                <w:rFonts w:ascii="Times New Roman" w:hAnsi="Times New Roman"/>
+                <w:b w:val="0"/>
+                <w:i w:val="0"/>
+                <w:sz w:val="18"/>
+              </w:rPr>
+              <w:t>7</w:t>
             </w:r>
           </w:p>
         </w:tc>
@@ -2694,9 +3919,354 @@
               <w:rPr>
                 <w:rFonts w:ascii="Times New Roman" w:hAnsi="Times New Roman"/>
                 <w:b w:val="0"/>
-                <w:sz w:val="16"/>
-              </w:rPr>
-              <w:t>1 600 9 000 5 800 3 600 600 1 800 500 3 000 25 000 2 500 8 500 10 500 700 1 000 1 000 1 000 1 000 6 000 400 400 2 000 300 3 500</w:t>
+                <w:i w:val="0"/>
+                <w:sz w:val="18"/>
+              </w:rPr>
+            </w:r>
+          </w:p>
+          <w:p>
+            <w:pPr>
+              <w:spacing w:after="0" w:before="0"/>
+              <w:jc w:val="center"/>
+            </w:pPr>
+            <w:r>
+              <w:rPr>
+                <w:rFonts w:ascii="Times New Roman" w:hAnsi="Times New Roman"/>
+                <w:b w:val="0"/>
+                <w:i w:val="0"/>
+                <w:sz w:val="18"/>
+              </w:rPr>
+              <w:t>1 600</w:t>
+            </w:r>
+          </w:p>
+          <w:p>
+            <w:pPr>
+              <w:spacing w:after="0" w:before="0"/>
+              <w:jc w:val="center"/>
+            </w:pPr>
+            <w:r>
+              <w:rPr>
+                <w:rFonts w:ascii="Times New Roman" w:hAnsi="Times New Roman"/>
+                <w:b w:val="0"/>
+                <w:i w:val="0"/>
+                <w:sz w:val="18"/>
+              </w:rPr>
+              <w:t>9 000</w:t>
+            </w:r>
+          </w:p>
+          <w:p>
+            <w:pPr>
+              <w:spacing w:after="0" w:before="0"/>
+              <w:jc w:val="center"/>
+            </w:pPr>
+            <w:r>
+              <w:rPr>
+                <w:rFonts w:ascii="Times New Roman" w:hAnsi="Times New Roman"/>
+                <w:b w:val="0"/>
+                <w:i w:val="0"/>
+                <w:sz w:val="18"/>
+              </w:rPr>
+              <w:t>5 800</w:t>
+            </w:r>
+          </w:p>
+          <w:p>
+            <w:pPr>
+              <w:spacing w:after="0" w:before="0"/>
+              <w:jc w:val="center"/>
+            </w:pPr>
+            <w:r>
+              <w:rPr>
+                <w:rFonts w:ascii="Times New Roman" w:hAnsi="Times New Roman"/>
+                <w:b w:val="0"/>
+                <w:i w:val="0"/>
+                <w:sz w:val="18"/>
+              </w:rPr>
+              <w:t>3 600</w:t>
+            </w:r>
+          </w:p>
+          <w:p>
+            <w:pPr>
+              <w:spacing w:after="0" w:before="0"/>
+              <w:jc w:val="center"/>
+            </w:pPr>
+            <w:r>
+              <w:rPr>
+                <w:rFonts w:ascii="Times New Roman" w:hAnsi="Times New Roman"/>
+                <w:b w:val="0"/>
+                <w:i w:val="0"/>
+                <w:sz w:val="18"/>
+              </w:rPr>
+              <w:t>600</w:t>
+            </w:r>
+          </w:p>
+          <w:p>
+            <w:pPr>
+              <w:spacing w:after="0" w:before="0"/>
+              <w:jc w:val="center"/>
+            </w:pPr>
+            <w:r>
+              <w:rPr>
+                <w:rFonts w:ascii="Times New Roman" w:hAnsi="Times New Roman"/>
+                <w:b w:val="0"/>
+                <w:i w:val="0"/>
+                <w:sz w:val="18"/>
+              </w:rPr>
+              <w:t>1 800</w:t>
+            </w:r>
+          </w:p>
+          <w:p>
+            <w:pPr>
+              <w:spacing w:after="0" w:before="0"/>
+              <w:jc w:val="center"/>
+            </w:pPr>
+            <w:r>
+              <w:rPr>
+                <w:rFonts w:ascii="Times New Roman" w:hAnsi="Times New Roman"/>
+                <w:b w:val="0"/>
+                <w:i w:val="0"/>
+                <w:sz w:val="18"/>
+              </w:rPr>
+              <w:t>500</w:t>
+            </w:r>
+          </w:p>
+          <w:p>
+            <w:pPr>
+              <w:spacing w:after="0" w:before="0"/>
+              <w:jc w:val="center"/>
+            </w:pPr>
+            <w:r>
+              <w:rPr>
+                <w:rFonts w:ascii="Times New Roman" w:hAnsi="Times New Roman"/>
+                <w:b w:val="0"/>
+                <w:i w:val="0"/>
+                <w:sz w:val="18"/>
+              </w:rPr>
+              <w:t>3 000</w:t>
+            </w:r>
+          </w:p>
+          <w:p>
+            <w:pPr>
+              <w:spacing w:after="0" w:before="0"/>
+              <w:jc w:val="center"/>
+            </w:pPr>
+            <w:r>
+              <w:rPr>
+                <w:rFonts w:ascii="Times New Roman" w:hAnsi="Times New Roman"/>
+                <w:b w:val="0"/>
+                <w:i w:val="0"/>
+                <w:sz w:val="18"/>
+              </w:rPr>
+              <w:t>25 000</w:t>
+            </w:r>
+          </w:p>
+          <w:p>
+            <w:pPr>
+              <w:spacing w:after="0" w:before="0"/>
+              <w:jc w:val="center"/>
+            </w:pPr>
+            <w:r>
+              <w:rPr>
+                <w:rFonts w:ascii="Times New Roman" w:hAnsi="Times New Roman"/>
+                <w:b w:val="0"/>
+                <w:i w:val="0"/>
+                <w:sz w:val="18"/>
+              </w:rPr>
+              <w:t>2 500</w:t>
+            </w:r>
+          </w:p>
+          <w:p>
+            <w:pPr>
+              <w:spacing w:after="0" w:before="0"/>
+              <w:jc w:val="center"/>
+            </w:pPr>
+            <w:r>
+              <w:rPr>
+                <w:rFonts w:ascii="Times New Roman" w:hAnsi="Times New Roman"/>
+                <w:b w:val="0"/>
+                <w:i w:val="0"/>
+                <w:sz w:val="18"/>
+              </w:rPr>
+              <w:t>8 500</w:t>
+            </w:r>
+          </w:p>
+          <w:p>
+            <w:pPr>
+              <w:spacing w:after="0" w:before="0"/>
+              <w:jc w:val="center"/>
+            </w:pPr>
+            <w:r>
+              <w:rPr>
+                <w:rFonts w:ascii="Times New Roman" w:hAnsi="Times New Roman"/>
+                <w:b w:val="0"/>
+                <w:i w:val="0"/>
+                <w:sz w:val="18"/>
+              </w:rPr>
+              <w:t>10 500</w:t>
+            </w:r>
+          </w:p>
+          <w:p>
+            <w:pPr>
+              <w:spacing w:after="0" w:before="0"/>
+              <w:jc w:val="center"/>
+            </w:pPr>
+            <w:r>
+              <w:rPr>
+                <w:rFonts w:ascii="Times New Roman" w:hAnsi="Times New Roman"/>
+                <w:b w:val="0"/>
+                <w:i w:val="0"/>
+                <w:sz w:val="18"/>
+              </w:rPr>
+              <w:t>700</w:t>
+            </w:r>
+          </w:p>
+          <w:p>
+            <w:pPr>
+              <w:spacing w:after="0" w:before="0"/>
+              <w:jc w:val="center"/>
+            </w:pPr>
+            <w:r>
+              <w:rPr>
+                <w:rFonts w:ascii="Times New Roman" w:hAnsi="Times New Roman"/>
+                <w:b w:val="0"/>
+                <w:i w:val="0"/>
+                <w:sz w:val="18"/>
+              </w:rPr>
+              <w:t>1 000</w:t>
+            </w:r>
+          </w:p>
+          <w:p>
+            <w:pPr>
+              <w:spacing w:after="0" w:before="0"/>
+              <w:jc w:val="center"/>
+            </w:pPr>
+            <w:r>
+              <w:rPr>
+                <w:rFonts w:ascii="Times New Roman" w:hAnsi="Times New Roman"/>
+                <w:b w:val="0"/>
+                <w:i w:val="0"/>
+                <w:sz w:val="18"/>
+              </w:rPr>
+              <w:t>1 000</w:t>
+            </w:r>
+          </w:p>
+          <w:p>
+            <w:pPr>
+              <w:spacing w:after="0" w:before="0"/>
+              <w:jc w:val="center"/>
+            </w:pPr>
+            <w:r>
+              <w:rPr>
+                <w:rFonts w:ascii="Times New Roman" w:hAnsi="Times New Roman"/>
+                <w:b w:val="0"/>
+                <w:i w:val="0"/>
+                <w:sz w:val="18"/>
+              </w:rPr>
+              <w:t>1 000</w:t>
+            </w:r>
+          </w:p>
+          <w:p>
+            <w:pPr>
+              <w:spacing w:after="0" w:before="0"/>
+              <w:jc w:val="center"/>
+            </w:pPr>
+            <w:r>
+              <w:rPr>
+                <w:rFonts w:ascii="Times New Roman" w:hAnsi="Times New Roman"/>
+                <w:b w:val="0"/>
+                <w:i w:val="0"/>
+                <w:sz w:val="18"/>
+              </w:rPr>
+              <w:t>1 000</w:t>
+            </w:r>
+          </w:p>
+          <w:p>
+            <w:pPr>
+              <w:spacing w:after="0" w:before="0"/>
+              <w:jc w:val="center"/>
+            </w:pPr>
+            <w:r>
+              <w:rPr>
+                <w:rFonts w:ascii="Times New Roman" w:hAnsi="Times New Roman"/>
+                <w:b w:val="0"/>
+                <w:i w:val="0"/>
+                <w:sz w:val="18"/>
+              </w:rPr>
+              <w:t>6 000</w:t>
+            </w:r>
+          </w:p>
+          <w:p>
+            <w:pPr>
+              <w:spacing w:after="0" w:before="0"/>
+              <w:jc w:val="center"/>
+            </w:pPr>
+            <w:r>
+              <w:rPr>
+                <w:rFonts w:ascii="Times New Roman" w:hAnsi="Times New Roman"/>
+                <w:b w:val="0"/>
+                <w:i w:val="0"/>
+                <w:sz w:val="18"/>
+              </w:rPr>
+              <w:t>400</w:t>
+            </w:r>
+          </w:p>
+          <w:p>
+            <w:pPr>
+              <w:spacing w:after="0" w:before="0"/>
+              <w:jc w:val="center"/>
+            </w:pPr>
+            <w:r>
+              <w:rPr>
+                <w:rFonts w:ascii="Times New Roman" w:hAnsi="Times New Roman"/>
+                <w:b w:val="0"/>
+                <w:i w:val="0"/>
+                <w:sz w:val="18"/>
+              </w:rPr>
+              <w:t>400</w:t>
+            </w:r>
+          </w:p>
+          <w:p>
+            <w:pPr>
+              <w:spacing w:after="0" w:before="0"/>
+              <w:jc w:val="center"/>
+            </w:pPr>
+            <w:r>
+              <w:rPr>
+                <w:rFonts w:ascii="Times New Roman" w:hAnsi="Times New Roman"/>
+                <w:b w:val="0"/>
+                <w:i w:val="0"/>
+                <w:sz w:val="18"/>
+              </w:rPr>
+              <w:t>2 000</w:t>
+            </w:r>
+          </w:p>
+          <w:p>
+            <w:pPr>
+              <w:spacing w:after="0" w:before="0"/>
+              <w:jc w:val="center"/>
+            </w:pPr>
+            <w:r>
+              <w:rPr>
+                <w:rFonts w:ascii="Times New Roman" w:hAnsi="Times New Roman"/>
+                <w:b w:val="0"/>
+                <w:i w:val="0"/>
+                <w:sz w:val="18"/>
+              </w:rPr>
+              <w:t>300</w:t>
+            </w:r>
+          </w:p>
+          <w:p>
+            <w:pPr>
+              <w:spacing w:after="0" w:before="0"/>
+              <w:jc w:val="center"/>
+            </w:pPr>
+            <w:r>
+              <w:rPr>
+                <w:rFonts w:ascii="Times New Roman" w:hAnsi="Times New Roman"/>
+                <w:b w:val="0"/>
+                <w:i w:val="0"/>
+                <w:sz w:val="18"/>
+              </w:rPr>
+              <w:t>3 500</w:t>
             </w:r>
           </w:p>
         </w:tc>
@@ -2715,9 +4285,9 @@
               <w:rPr>
                 <w:rFonts w:ascii="Times New Roman" w:hAnsi="Times New Roman"/>
                 <w:b w:val="0"/>
-                <w:sz w:val="16"/>
-              </w:rPr>
-              <w:t>9 600 9 000 81 200 43 200 36 000 10 800 9 000 36 000 50 000 5 000 8 500 10 500 12 600 18 000 18 000 18 000 6 000 36 000 9 600 14 400 2 000 3 600 24 500</w:t>
+                <w:i w:val="0"/>
+                <w:sz w:val="18"/>
+              </w:rPr>
             </w:r>
           </w:p>
           <w:p>
@@ -2729,7 +4299,353 @@
               <w:rPr>
                 <w:rFonts w:ascii="Times New Roman" w:hAnsi="Times New Roman"/>
                 <w:b w:val="0"/>
-                <w:sz w:val="16"/>
+                <w:i w:val="0"/>
+                <w:sz w:val="18"/>
+              </w:rPr>
+              <w:t>9 600</w:t>
+            </w:r>
+          </w:p>
+          <w:p>
+            <w:pPr>
+              <w:spacing w:after="0" w:before="0"/>
+              <w:jc w:val="center"/>
+            </w:pPr>
+            <w:r>
+              <w:rPr>
+                <w:rFonts w:ascii="Times New Roman" w:hAnsi="Times New Roman"/>
+                <w:b w:val="0"/>
+                <w:i w:val="0"/>
+                <w:sz w:val="18"/>
+              </w:rPr>
+              <w:t>9 000</w:t>
+            </w:r>
+          </w:p>
+          <w:p>
+            <w:pPr>
+              <w:spacing w:after="0" w:before="0"/>
+              <w:jc w:val="center"/>
+            </w:pPr>
+            <w:r>
+              <w:rPr>
+                <w:rFonts w:ascii="Times New Roman" w:hAnsi="Times New Roman"/>
+                <w:b w:val="0"/>
+                <w:i w:val="0"/>
+                <w:sz w:val="18"/>
+              </w:rPr>
+              <w:t>81 200</w:t>
+            </w:r>
+          </w:p>
+          <w:p>
+            <w:pPr>
+              <w:spacing w:after="0" w:before="0"/>
+              <w:jc w:val="center"/>
+            </w:pPr>
+            <w:r>
+              <w:rPr>
+                <w:rFonts w:ascii="Times New Roman" w:hAnsi="Times New Roman"/>
+                <w:b w:val="0"/>
+                <w:i w:val="0"/>
+                <w:sz w:val="18"/>
+              </w:rPr>
+              <w:t>43 200</w:t>
+            </w:r>
+          </w:p>
+          <w:p>
+            <w:pPr>
+              <w:spacing w:after="0" w:before="0"/>
+              <w:jc w:val="center"/>
+            </w:pPr>
+            <w:r>
+              <w:rPr>
+                <w:rFonts w:ascii="Times New Roman" w:hAnsi="Times New Roman"/>
+                <w:b w:val="0"/>
+                <w:i w:val="0"/>
+                <w:sz w:val="18"/>
+              </w:rPr>
+              <w:t>36 000</w:t>
+            </w:r>
+          </w:p>
+          <w:p>
+            <w:pPr>
+              <w:spacing w:after="0" w:before="0"/>
+              <w:jc w:val="center"/>
+            </w:pPr>
+            <w:r>
+              <w:rPr>
+                <w:rFonts w:ascii="Times New Roman" w:hAnsi="Times New Roman"/>
+                <w:b w:val="0"/>
+                <w:i w:val="0"/>
+                <w:sz w:val="18"/>
+              </w:rPr>
+              <w:t>10 800</w:t>
+            </w:r>
+          </w:p>
+          <w:p>
+            <w:pPr>
+              <w:spacing w:after="0" w:before="0"/>
+              <w:jc w:val="center"/>
+            </w:pPr>
+            <w:r>
+              <w:rPr>
+                <w:rFonts w:ascii="Times New Roman" w:hAnsi="Times New Roman"/>
+                <w:b w:val="0"/>
+                <w:i w:val="0"/>
+                <w:sz w:val="18"/>
+              </w:rPr>
+              <w:t>9 000</w:t>
+            </w:r>
+          </w:p>
+          <w:p>
+            <w:pPr>
+              <w:spacing w:after="0" w:before="0"/>
+              <w:jc w:val="center"/>
+            </w:pPr>
+            <w:r>
+              <w:rPr>
+                <w:rFonts w:ascii="Times New Roman" w:hAnsi="Times New Roman"/>
+                <w:b w:val="0"/>
+                <w:i w:val="0"/>
+                <w:sz w:val="18"/>
+              </w:rPr>
+              <w:t>36 000</w:t>
+            </w:r>
+          </w:p>
+          <w:p>
+            <w:pPr>
+              <w:spacing w:after="0" w:before="0"/>
+              <w:jc w:val="center"/>
+            </w:pPr>
+            <w:r>
+              <w:rPr>
+                <w:rFonts w:ascii="Times New Roman" w:hAnsi="Times New Roman"/>
+                <w:b w:val="0"/>
+                <w:i w:val="0"/>
+                <w:sz w:val="18"/>
+              </w:rPr>
+              <w:t>50 000</w:t>
+            </w:r>
+          </w:p>
+          <w:p>
+            <w:pPr>
+              <w:spacing w:after="0" w:before="0"/>
+              <w:jc w:val="center"/>
+            </w:pPr>
+            <w:r>
+              <w:rPr>
+                <w:rFonts w:ascii="Times New Roman" w:hAnsi="Times New Roman"/>
+                <w:b w:val="0"/>
+                <w:i w:val="0"/>
+                <w:sz w:val="18"/>
+              </w:rPr>
+              <w:t>5 000</w:t>
+            </w:r>
+          </w:p>
+          <w:p>
+            <w:pPr>
+              <w:spacing w:after="0" w:before="0"/>
+              <w:jc w:val="center"/>
+            </w:pPr>
+            <w:r>
+              <w:rPr>
+                <w:rFonts w:ascii="Times New Roman" w:hAnsi="Times New Roman"/>
+                <w:b w:val="0"/>
+                <w:i w:val="0"/>
+                <w:sz w:val="18"/>
+              </w:rPr>
+              <w:t>8 500</w:t>
+            </w:r>
+          </w:p>
+          <w:p>
+            <w:pPr>
+              <w:spacing w:after="0" w:before="0"/>
+              <w:jc w:val="center"/>
+            </w:pPr>
+            <w:r>
+              <w:rPr>
+                <w:rFonts w:ascii="Times New Roman" w:hAnsi="Times New Roman"/>
+                <w:b w:val="0"/>
+                <w:i w:val="0"/>
+                <w:sz w:val="18"/>
+              </w:rPr>
+              <w:t>10 500</w:t>
+            </w:r>
+          </w:p>
+          <w:p>
+            <w:pPr>
+              <w:spacing w:after="0" w:before="0"/>
+              <w:jc w:val="center"/>
+            </w:pPr>
+            <w:r>
+              <w:rPr>
+                <w:rFonts w:ascii="Times New Roman" w:hAnsi="Times New Roman"/>
+                <w:b w:val="0"/>
+                <w:i w:val="0"/>
+                <w:sz w:val="18"/>
+              </w:rPr>
+              <w:t>12 600</w:t>
+            </w:r>
+          </w:p>
+          <w:p>
+            <w:pPr>
+              <w:spacing w:after="0" w:before="0"/>
+              <w:jc w:val="center"/>
+            </w:pPr>
+            <w:r>
+              <w:rPr>
+                <w:rFonts w:ascii="Times New Roman" w:hAnsi="Times New Roman"/>
+                <w:b w:val="0"/>
+                <w:i w:val="0"/>
+                <w:sz w:val="18"/>
+              </w:rPr>
+              <w:t>18 000</w:t>
+            </w:r>
+          </w:p>
+          <w:p>
+            <w:pPr>
+              <w:spacing w:after="0" w:before="0"/>
+              <w:jc w:val="center"/>
+            </w:pPr>
+            <w:r>
+              <w:rPr>
+                <w:rFonts w:ascii="Times New Roman" w:hAnsi="Times New Roman"/>
+                <w:b w:val="0"/>
+                <w:i w:val="0"/>
+                <w:sz w:val="18"/>
+              </w:rPr>
+              <w:t>18 000</w:t>
+            </w:r>
+          </w:p>
+          <w:p>
+            <w:pPr>
+              <w:spacing w:after="0" w:before="0"/>
+              <w:jc w:val="center"/>
+            </w:pPr>
+            <w:r>
+              <w:rPr>
+                <w:rFonts w:ascii="Times New Roman" w:hAnsi="Times New Roman"/>
+                <w:b w:val="0"/>
+                <w:i w:val="0"/>
+                <w:sz w:val="18"/>
+              </w:rPr>
+              <w:t>18 000</w:t>
+            </w:r>
+          </w:p>
+          <w:p>
+            <w:pPr>
+              <w:spacing w:after="0" w:before="0"/>
+              <w:jc w:val="center"/>
+            </w:pPr>
+            <w:r>
+              <w:rPr>
+                <w:rFonts w:ascii="Times New Roman" w:hAnsi="Times New Roman"/>
+                <w:b w:val="0"/>
+                <w:i w:val="0"/>
+                <w:sz w:val="18"/>
+              </w:rPr>
+              <w:t>6 000</w:t>
+            </w:r>
+          </w:p>
+          <w:p>
+            <w:pPr>
+              <w:spacing w:after="0" w:before="0"/>
+              <w:jc w:val="center"/>
+            </w:pPr>
+            <w:r>
+              <w:rPr>
+                <w:rFonts w:ascii="Times New Roman" w:hAnsi="Times New Roman"/>
+                <w:b w:val="0"/>
+                <w:i w:val="0"/>
+                <w:sz w:val="18"/>
+              </w:rPr>
+              <w:t>36 000</w:t>
+            </w:r>
+          </w:p>
+          <w:p>
+            <w:pPr>
+              <w:spacing w:after="0" w:before="0"/>
+              <w:jc w:val="center"/>
+            </w:pPr>
+            <w:r>
+              <w:rPr>
+                <w:rFonts w:ascii="Times New Roman" w:hAnsi="Times New Roman"/>
+                <w:b w:val="0"/>
+                <w:i w:val="0"/>
+                <w:sz w:val="18"/>
+              </w:rPr>
+              <w:t>9 600</w:t>
+            </w:r>
+          </w:p>
+          <w:p>
+            <w:pPr>
+              <w:spacing w:after="0" w:before="0"/>
+              <w:jc w:val="center"/>
+            </w:pPr>
+            <w:r>
+              <w:rPr>
+                <w:rFonts w:ascii="Times New Roman" w:hAnsi="Times New Roman"/>
+                <w:b w:val="0"/>
+                <w:i w:val="0"/>
+                <w:sz w:val="18"/>
+              </w:rPr>
+              <w:t>14 400</w:t>
+            </w:r>
+          </w:p>
+          <w:p>
+            <w:pPr>
+              <w:spacing w:after="0" w:before="0"/>
+              <w:jc w:val="center"/>
+            </w:pPr>
+            <w:r>
+              <w:rPr>
+                <w:rFonts w:ascii="Times New Roman" w:hAnsi="Times New Roman"/>
+                <w:b w:val="0"/>
+                <w:i w:val="0"/>
+                <w:sz w:val="18"/>
+              </w:rPr>
+              <w:t>2 000</w:t>
+            </w:r>
+          </w:p>
+          <w:p>
+            <w:pPr>
+              <w:spacing w:after="0" w:before="0"/>
+              <w:jc w:val="center"/>
+            </w:pPr>
+            <w:r>
+              <w:rPr>
+                <w:rFonts w:ascii="Times New Roman" w:hAnsi="Times New Roman"/>
+                <w:b w:val="0"/>
+                <w:i w:val="0"/>
+                <w:sz w:val="18"/>
+              </w:rPr>
+              <w:t>3 600</w:t>
+            </w:r>
+          </w:p>
+          <w:p>
+            <w:pPr>
+              <w:spacing w:after="0" w:before="0"/>
+              <w:jc w:val="center"/>
+            </w:pPr>
+            <w:r>
+              <w:rPr>
+                <w:rFonts w:ascii="Times New Roman" w:hAnsi="Times New Roman"/>
+                <w:b w:val="0"/>
+                <w:i w:val="0"/>
+                <w:sz w:val="18"/>
+              </w:rPr>
+              <w:t>24 500</w:t>
+            </w:r>
+          </w:p>
+          <w:p>
+            <w:pPr>
+              <w:spacing w:after="0" w:before="0"/>
+              <w:jc w:val="center"/>
+            </w:pPr>
+            <w:r>
+              <w:rPr>
+                <w:rFonts w:ascii="Times New Roman" w:hAnsi="Times New Roman"/>
+                <w:b/>
+                <w:i/>
+                <w:sz w:val="18"/>
               </w:rPr>
               <w:t>ST : 471 500</w:t>
             </w:r>
@@ -2750,6 +4666,7 @@
               <w:rPr>
                 <w:rFonts w:ascii="Times New Roman" w:hAnsi="Times New Roman"/>
                 <w:b w:val="0"/>
+                <w:i w:val="0"/>
                 <w:sz w:val="16"/>
               </w:rPr>
               <w:t>Caisse école : RPI (Etat)</w:t>
@@ -2771,6 +4688,7 @@
               <w:rPr>
                 <w:rFonts w:ascii="Times New Roman" w:hAnsi="Times New Roman"/>
                 <w:b w:val="0"/>
+                <w:i w:val="0"/>
                 <w:sz w:val="16"/>
               </w:rPr>
               <w:t>Ny Filoha, Ny Tale, Ny Trésorier</w:t>
@@ -2792,9 +4710,10 @@
               <w:rPr>
                 <w:rFonts w:ascii="Times New Roman" w:hAnsi="Times New Roman"/>
                 <w:b w:val="0"/>
+                <w:i w:val="0"/>
                 <w:sz w:val="16"/>
               </w:rPr>
-              <w:t>Ny Filohan’ny FEFFI, Ny Mpitam-bola, Ny Mpitam-tsoratra, Ny Mpanara-maso ny Kaonty</w:t>
+              <w:t>Ny Filohan’ny FEFFI, Ny Mpitam-bola, Ny Mpitam-tsoratra</w:t>
             </w:r>
           </w:p>
         </w:tc>
@@ -2836,7 +4755,8 @@
               <w:rPr>
                 <w:rFonts w:ascii="Times New Roman" w:hAnsi="Times New Roman"/>
                 <w:b w:val="0"/>
-                <w:sz w:val="16"/>
+                <w:i w:val="0"/>
+                <w:sz w:val="18"/>
               </w:rPr>
               <w:t>• Blanco pen</w:t>
             </w:r>
@@ -2850,7 +4770,8 @@
               <w:rPr>
                 <w:rFonts w:ascii="Times New Roman" w:hAnsi="Times New Roman"/>
                 <w:b w:val="0"/>
-                <w:sz w:val="16"/>
+                <w:i w:val="0"/>
+                <w:sz w:val="18"/>
               </w:rPr>
               <w:t>• Cahier de transmission</w:t>
             </w:r>
@@ -2864,7 +4785,8 @@
               <w:rPr>
                 <w:rFonts w:ascii="Times New Roman" w:hAnsi="Times New Roman"/>
                 <w:b w:val="0"/>
-                <w:sz w:val="16"/>
+                <w:i w:val="0"/>
+                <w:sz w:val="18"/>
               </w:rPr>
               <w:t>• Cahier de départ</w:t>
             </w:r>
@@ -2878,7 +4800,8 @@
               <w:rPr>
                 <w:rFonts w:ascii="Times New Roman" w:hAnsi="Times New Roman"/>
                 <w:b w:val="0"/>
-                <w:sz w:val="16"/>
+                <w:i w:val="0"/>
+                <w:sz w:val="18"/>
               </w:rPr>
               <w:t>• Cahier d’arrivée</w:t>
             </w:r>
@@ -2892,7 +4815,8 @@
               <w:rPr>
                 <w:rFonts w:ascii="Times New Roman" w:hAnsi="Times New Roman"/>
                 <w:b w:val="0"/>
-                <w:sz w:val="16"/>
+                <w:i w:val="0"/>
+                <w:sz w:val="18"/>
               </w:rPr>
               <w:t>• Décamètre à 20 m</w:t>
             </w:r>
@@ -2906,7 +4830,8 @@
               <w:rPr>
                 <w:rFonts w:ascii="Times New Roman" w:hAnsi="Times New Roman"/>
                 <w:b w:val="0"/>
-                <w:sz w:val="16"/>
+                <w:i w:val="0"/>
+                <w:sz w:val="18"/>
               </w:rPr>
               <w:t>• Masking Tape</w:t>
             </w:r>
@@ -2920,7 +4845,8 @@
               <w:rPr>
                 <w:rFonts w:ascii="Times New Roman" w:hAnsi="Times New Roman"/>
                 <w:b w:val="0"/>
-                <w:sz w:val="16"/>
+                <w:i w:val="0"/>
+                <w:sz w:val="18"/>
               </w:rPr>
               <w:t>• Nappe de table lamba/m</w:t>
             </w:r>
@@ -2934,7 +4860,8 @@
               <w:rPr>
                 <w:rFonts w:ascii="Times New Roman" w:hAnsi="Times New Roman"/>
                 <w:b w:val="0"/>
-                <w:sz w:val="16"/>
+                <w:i w:val="0"/>
+                <w:sz w:val="18"/>
               </w:rPr>
               <w:t>• Papier Velin ram</w:t>
             </w:r>
@@ -2948,7 +4875,8 @@
               <w:rPr>
                 <w:rFonts w:ascii="Times New Roman" w:hAnsi="Times New Roman"/>
                 <w:b w:val="0"/>
-                <w:sz w:val="16"/>
+                <w:i w:val="0"/>
+                <w:sz w:val="18"/>
               </w:rPr>
               <w:t>• Enveloppe blanc PM</w:t>
             </w:r>
@@ -2969,9 +4897,130 @@
               <w:rPr>
                 <w:rFonts w:ascii="Times New Roman" w:hAnsi="Times New Roman"/>
                 <w:b w:val="0"/>
-                <w:sz w:val="16"/>
-              </w:rPr>
-              <w:t>6 1 1 1 1 6 1 1 12</w:t>
+                <w:i w:val="0"/>
+                <w:sz w:val="18"/>
+              </w:rPr>
+              <w:t>6</w:t>
+            </w:r>
+          </w:p>
+          <w:p>
+            <w:pPr>
+              <w:spacing w:after="0" w:before="0"/>
+              <w:jc w:val="center"/>
+            </w:pPr>
+            <w:r>
+              <w:rPr>
+                <w:rFonts w:ascii="Times New Roman" w:hAnsi="Times New Roman"/>
+                <w:b w:val="0"/>
+                <w:i w:val="0"/>
+                <w:sz w:val="18"/>
+              </w:rPr>
+              <w:t>1</w:t>
+            </w:r>
+          </w:p>
+          <w:p>
+            <w:pPr>
+              <w:spacing w:after="0" w:before="0"/>
+              <w:jc w:val="center"/>
+            </w:pPr>
+            <w:r>
+              <w:rPr>
+                <w:rFonts w:ascii="Times New Roman" w:hAnsi="Times New Roman"/>
+                <w:b w:val="0"/>
+                <w:i w:val="0"/>
+                <w:sz w:val="18"/>
+              </w:rPr>
+              <w:t>1</w:t>
+            </w:r>
+          </w:p>
+          <w:p>
+            <w:pPr>
+              <w:spacing w:after="0" w:before="0"/>
+              <w:jc w:val="center"/>
+            </w:pPr>
+            <w:r>
+              <w:rPr>
+                <w:rFonts w:ascii="Times New Roman" w:hAnsi="Times New Roman"/>
+                <w:b w:val="0"/>
+                <w:i w:val="0"/>
+                <w:sz w:val="18"/>
+              </w:rPr>
+              <w:t>1</w:t>
+            </w:r>
+          </w:p>
+          <w:p>
+            <w:pPr>
+              <w:spacing w:after="0" w:before="0"/>
+              <w:jc w:val="center"/>
+            </w:pPr>
+            <w:r>
+              <w:rPr>
+                <w:rFonts w:ascii="Times New Roman" w:hAnsi="Times New Roman"/>
+                <w:b w:val="0"/>
+                <w:i w:val="0"/>
+                <w:sz w:val="18"/>
+              </w:rPr>
+              <w:t>1</w:t>
+            </w:r>
+          </w:p>
+          <w:p>
+            <w:pPr>
+              <w:spacing w:after="0" w:before="0"/>
+              <w:jc w:val="center"/>
+            </w:pPr>
+            <w:r>
+              <w:rPr>
+                <w:rFonts w:ascii="Times New Roman" w:hAnsi="Times New Roman"/>
+                <w:b w:val="0"/>
+                <w:i w:val="0"/>
+                <w:sz w:val="18"/>
+              </w:rPr>
+              <w:t>6</w:t>
+            </w:r>
+          </w:p>
+          <w:p>
+            <w:pPr>
+              <w:spacing w:after="0" w:before="0"/>
+              <w:jc w:val="center"/>
+            </w:pPr>
+            <w:r>
+              <w:rPr>
+                <w:rFonts w:ascii="Times New Roman" w:hAnsi="Times New Roman"/>
+                <w:b w:val="0"/>
+                <w:i w:val="0"/>
+                <w:sz w:val="18"/>
+              </w:rPr>
+              <w:t>1</w:t>
+            </w:r>
+          </w:p>
+          <w:p>
+            <w:pPr>
+              <w:spacing w:after="0" w:before="0"/>
+              <w:jc w:val="center"/>
+            </w:pPr>
+            <w:r>
+              <w:rPr>
+                <w:rFonts w:ascii="Times New Roman" w:hAnsi="Times New Roman"/>
+                <w:b w:val="0"/>
+                <w:i w:val="0"/>
+                <w:sz w:val="18"/>
+              </w:rPr>
+              <w:t>1</w:t>
+            </w:r>
+          </w:p>
+          <w:p>
+            <w:pPr>
+              <w:spacing w:after="0" w:before="0"/>
+              <w:jc w:val="center"/>
+            </w:pPr>
+            <w:r>
+              <w:rPr>
+                <w:rFonts w:ascii="Times New Roman" w:hAnsi="Times New Roman"/>
+                <w:b w:val="0"/>
+                <w:i w:val="0"/>
+                <w:sz w:val="18"/>
+              </w:rPr>
+              <w:t>12</w:t>
             </w:r>
           </w:p>
         </w:tc>
@@ -2990,9 +5039,130 @@
               <w:rPr>
                 <w:rFonts w:ascii="Times New Roman" w:hAnsi="Times New Roman"/>
                 <w:b w:val="0"/>
-                <w:sz w:val="16"/>
-              </w:rPr>
-              <w:t>2 000 11 000 8 000 8 000 18 000 3 000 9 000 25 000 100</w:t>
+                <w:i w:val="0"/>
+                <w:sz w:val="18"/>
+              </w:rPr>
+              <w:t>2 000</w:t>
+            </w:r>
+          </w:p>
+          <w:p>
+            <w:pPr>
+              <w:spacing w:after="0" w:before="0"/>
+              <w:jc w:val="center"/>
+            </w:pPr>
+            <w:r>
+              <w:rPr>
+                <w:rFonts w:ascii="Times New Roman" w:hAnsi="Times New Roman"/>
+                <w:b w:val="0"/>
+                <w:i w:val="0"/>
+                <w:sz w:val="18"/>
+              </w:rPr>
+              <w:t>11 000</w:t>
+            </w:r>
+          </w:p>
+          <w:p>
+            <w:pPr>
+              <w:spacing w:after="0" w:before="0"/>
+              <w:jc w:val="center"/>
+            </w:pPr>
+            <w:r>
+              <w:rPr>
+                <w:rFonts w:ascii="Times New Roman" w:hAnsi="Times New Roman"/>
+                <w:b w:val="0"/>
+                <w:i w:val="0"/>
+                <w:sz w:val="18"/>
+              </w:rPr>
+              <w:t>8 000</w:t>
+            </w:r>
+          </w:p>
+          <w:p>
+            <w:pPr>
+              <w:spacing w:after="0" w:before="0"/>
+              <w:jc w:val="center"/>
+            </w:pPr>
+            <w:r>
+              <w:rPr>
+                <w:rFonts w:ascii="Times New Roman" w:hAnsi="Times New Roman"/>
+                <w:b w:val="0"/>
+                <w:i w:val="0"/>
+                <w:sz w:val="18"/>
+              </w:rPr>
+              <w:t>8 000</w:t>
+            </w:r>
+          </w:p>
+          <w:p>
+            <w:pPr>
+              <w:spacing w:after="0" w:before="0"/>
+              <w:jc w:val="center"/>
+            </w:pPr>
+            <w:r>
+              <w:rPr>
+                <w:rFonts w:ascii="Times New Roman" w:hAnsi="Times New Roman"/>
+                <w:b w:val="0"/>
+                <w:i w:val="0"/>
+                <w:sz w:val="18"/>
+              </w:rPr>
+              <w:t>18 000</w:t>
+            </w:r>
+          </w:p>
+          <w:p>
+            <w:pPr>
+              <w:spacing w:after="0" w:before="0"/>
+              <w:jc w:val="center"/>
+            </w:pPr>
+            <w:r>
+              <w:rPr>
+                <w:rFonts w:ascii="Times New Roman" w:hAnsi="Times New Roman"/>
+                <w:b w:val="0"/>
+                <w:i w:val="0"/>
+                <w:sz w:val="18"/>
+              </w:rPr>
+              <w:t>3 000</w:t>
+            </w:r>
+          </w:p>
+          <w:p>
+            <w:pPr>
+              <w:spacing w:after="0" w:before="0"/>
+              <w:jc w:val="center"/>
+            </w:pPr>
+            <w:r>
+              <w:rPr>
+                <w:rFonts w:ascii="Times New Roman" w:hAnsi="Times New Roman"/>
+                <w:b w:val="0"/>
+                <w:i w:val="0"/>
+                <w:sz w:val="18"/>
+              </w:rPr>
+              <w:t>9 000</w:t>
+            </w:r>
+          </w:p>
+          <w:p>
+            <w:pPr>
+              <w:spacing w:after="0" w:before="0"/>
+              <w:jc w:val="center"/>
+            </w:pPr>
+            <w:r>
+              <w:rPr>
+                <w:rFonts w:ascii="Times New Roman" w:hAnsi="Times New Roman"/>
+                <w:b w:val="0"/>
+                <w:i w:val="0"/>
+                <w:sz w:val="18"/>
+              </w:rPr>
+              <w:t>25 000</w:t>
+            </w:r>
+          </w:p>
+          <w:p>
+            <w:pPr>
+              <w:spacing w:after="0" w:before="0"/>
+              <w:jc w:val="center"/>
+            </w:pPr>
+            <w:r>
+              <w:rPr>
+                <w:rFonts w:ascii="Times New Roman" w:hAnsi="Times New Roman"/>
+                <w:b w:val="0"/>
+                <w:i w:val="0"/>
+                <w:sz w:val="18"/>
+              </w:rPr>
+              <w:t>100</w:t>
             </w:r>
           </w:p>
         </w:tc>
@@ -3011,9 +5181,10 @@
               <w:rPr>
                 <w:rFonts w:ascii="Times New Roman" w:hAnsi="Times New Roman"/>
                 <w:b w:val="0"/>
-                <w:sz w:val="16"/>
-              </w:rPr>
-              <w:t>12 000 11 000 8 000 8 000 18 000 18 000 9 000 25 000 1 200</w:t>
+                <w:i w:val="0"/>
+                <w:sz w:val="18"/>
+              </w:rPr>
+              <w:t>12 000</w:t>
             </w:r>
           </w:p>
           <w:p>
@@ -3025,7 +5196,128 @@
               <w:rPr>
                 <w:rFonts w:ascii="Times New Roman" w:hAnsi="Times New Roman"/>
                 <w:b w:val="0"/>
-                <w:sz w:val="16"/>
+                <w:i w:val="0"/>
+                <w:sz w:val="18"/>
+              </w:rPr>
+              <w:t>11 000</w:t>
+            </w:r>
+          </w:p>
+          <w:p>
+            <w:pPr>
+              <w:spacing w:after="0" w:before="0"/>
+              <w:jc w:val="center"/>
+            </w:pPr>
+            <w:r>
+              <w:rPr>
+                <w:rFonts w:ascii="Times New Roman" w:hAnsi="Times New Roman"/>
+                <w:b w:val="0"/>
+                <w:i w:val="0"/>
+                <w:sz w:val="18"/>
+              </w:rPr>
+              <w:t>8 000</w:t>
+            </w:r>
+          </w:p>
+          <w:p>
+            <w:pPr>
+              <w:spacing w:after="0" w:before="0"/>
+              <w:jc w:val="center"/>
+            </w:pPr>
+            <w:r>
+              <w:rPr>
+                <w:rFonts w:ascii="Times New Roman" w:hAnsi="Times New Roman"/>
+                <w:b w:val="0"/>
+                <w:i w:val="0"/>
+                <w:sz w:val="18"/>
+              </w:rPr>
+              <w:t>8 000</w:t>
+            </w:r>
+          </w:p>
+          <w:p>
+            <w:pPr>
+              <w:spacing w:after="0" w:before="0"/>
+              <w:jc w:val="center"/>
+            </w:pPr>
+            <w:r>
+              <w:rPr>
+                <w:rFonts w:ascii="Times New Roman" w:hAnsi="Times New Roman"/>
+                <w:b w:val="0"/>
+                <w:i w:val="0"/>
+                <w:sz w:val="18"/>
+              </w:rPr>
+              <w:t>18 000</w:t>
+            </w:r>
+          </w:p>
+          <w:p>
+            <w:pPr>
+              <w:spacing w:after="0" w:before="0"/>
+              <w:jc w:val="center"/>
+            </w:pPr>
+            <w:r>
+              <w:rPr>
+                <w:rFonts w:ascii="Times New Roman" w:hAnsi="Times New Roman"/>
+                <w:b w:val="0"/>
+                <w:i w:val="0"/>
+                <w:sz w:val="18"/>
+              </w:rPr>
+              <w:t>18 000</w:t>
+            </w:r>
+          </w:p>
+          <w:p>
+            <w:pPr>
+              <w:spacing w:after="0" w:before="0"/>
+              <w:jc w:val="center"/>
+            </w:pPr>
+            <w:r>
+              <w:rPr>
+                <w:rFonts w:ascii="Times New Roman" w:hAnsi="Times New Roman"/>
+                <w:b w:val="0"/>
+                <w:i w:val="0"/>
+                <w:sz w:val="18"/>
+              </w:rPr>
+              <w:t>9 000</w:t>
+            </w:r>
+          </w:p>
+          <w:p>
+            <w:pPr>
+              <w:spacing w:after="0" w:before="0"/>
+              <w:jc w:val="center"/>
+            </w:pPr>
+            <w:r>
+              <w:rPr>
+                <w:rFonts w:ascii="Times New Roman" w:hAnsi="Times New Roman"/>
+                <w:b w:val="0"/>
+                <w:i w:val="0"/>
+                <w:sz w:val="18"/>
+              </w:rPr>
+              <w:t>25 000</w:t>
+            </w:r>
+          </w:p>
+          <w:p>
+            <w:pPr>
+              <w:spacing w:after="0" w:before="0"/>
+              <w:jc w:val="center"/>
+            </w:pPr>
+            <w:r>
+              <w:rPr>
+                <w:rFonts w:ascii="Times New Roman" w:hAnsi="Times New Roman"/>
+                <w:b w:val="0"/>
+                <w:i w:val="0"/>
+                <w:sz w:val="18"/>
+              </w:rPr>
+              <w:t>1 200</w:t>
+            </w:r>
+          </w:p>
+          <w:p>
+            <w:pPr>
+              <w:spacing w:after="0" w:before="0"/>
+              <w:jc w:val="center"/>
+            </w:pPr>
+            <w:r>
+              <w:rPr>
+                <w:rFonts w:ascii="Times New Roman" w:hAnsi="Times New Roman"/>
+                <w:b/>
+                <w:i/>
+                <w:sz w:val="18"/>
               </w:rPr>
               <w:t>ST : 110 200</w:t>
             </w:r>
@@ -3046,6 +5338,7 @@
               <w:rPr>
                 <w:rFonts w:ascii="Times New Roman" w:hAnsi="Times New Roman"/>
                 <w:b w:val="0"/>
+                <w:i w:val="0"/>
                 <w:sz w:val="16"/>
               </w:rPr>
               <w:t>Caisse école : FCE</w:t>
@@ -3067,6 +5360,7 @@
               <w:rPr>
                 <w:rFonts w:ascii="Times New Roman" w:hAnsi="Times New Roman"/>
                 <w:b w:val="0"/>
+                <w:i w:val="0"/>
                 <w:sz w:val="16"/>
               </w:rPr>
               <w:t>–</w:t>
@@ -3088,9 +5382,10 @@
               <w:rPr>
                 <w:rFonts w:ascii="Times New Roman" w:hAnsi="Times New Roman"/>
                 <w:b w:val="0"/>
+                <w:i w:val="0"/>
                 <w:sz w:val="16"/>
               </w:rPr>
-              <w:t>Ny Filohan’ny FEFFI, Ny Mpitam-bola, Ny Mpitam-tsoratra, Ny Mpanara-maso ny Kaonty</w:t>
+              <w:t>Ny Filohan’ny FEFFI, Ny Mpitam-bola, Ny Mpitam-tsoratra</w:t>
             </w:r>
           </w:p>
         </w:tc>
@@ -3112,6 +5407,7 @@
               <w:rPr>
                 <w:rFonts w:ascii="Times New Roman" w:hAnsi="Times New Roman"/>
                 <w:b/>
+                <w:i w:val="0"/>
                 <w:sz w:val="16"/>
               </w:rPr>
               <w:t>KALITAOM-PAMPIANARANA SY FIANARANA</w:t>
@@ -3133,6 +5429,7 @@
               <w:rPr>
                 <w:rFonts w:ascii="Times New Roman" w:hAnsi="Times New Roman"/>
                 <w:b w:val="0"/>
+                <w:i w:val="0"/>
                 <w:sz w:val="16"/>
               </w:rPr>
               <w:t>Fandraisana mpampianatra</w:t>
@@ -3154,6 +5451,7 @@
               <w:rPr>
                 <w:rFonts w:ascii="Times New Roman" w:hAnsi="Times New Roman"/>
                 <w:b w:val="0"/>
+                <w:i w:val="0"/>
                 <w:sz w:val="16"/>
               </w:rPr>
               <w:t>Septambra 2026 – Jona 2027</w:t>
@@ -3175,7 +5473,8 @@
               <w:rPr>
                 <w:rFonts w:ascii="Times New Roman" w:hAnsi="Times New Roman"/>
                 <w:b w:val="0"/>
-                <w:sz w:val="16"/>
+                <w:i w:val="0"/>
+                <w:sz w:val="18"/>
               </w:rPr>
               <w:t>Fandoavana :</w:t>
             </w:r>
@@ -3189,7 +5488,8 @@
               <w:rPr>
                 <w:rFonts w:ascii="Times New Roman" w:hAnsi="Times New Roman"/>
                 <w:b w:val="0"/>
-                <w:sz w:val="16"/>
+                <w:i w:val="0"/>
+                <w:sz w:val="18"/>
               </w:rPr>
               <w:t>• Karamana mpampianatra</w:t>
             </w:r>
@@ -3210,7 +5510,22 @@
               <w:rPr>
                 <w:rFonts w:ascii="Times New Roman" w:hAnsi="Times New Roman"/>
                 <w:b w:val="0"/>
-                <w:sz w:val="16"/>
+                <w:i w:val="0"/>
+                <w:sz w:val="18"/>
+              </w:rPr>
+            </w:r>
+          </w:p>
+          <w:p>
+            <w:pPr>
+              <w:spacing w:after="0" w:before="0"/>
+              <w:jc w:val="center"/>
+            </w:pPr>
+            <w:r>
+              <w:rPr>
+                <w:rFonts w:ascii="Times New Roman" w:hAnsi="Times New Roman"/>
+                <w:b w:val="0"/>
+                <w:i w:val="0"/>
+                <w:sz w:val="18"/>
               </w:rPr>
               <w:t>4</w:t>
             </w:r>
@@ -3231,7 +5546,22 @@
               <w:rPr>
                 <w:rFonts w:ascii="Times New Roman" w:hAnsi="Times New Roman"/>
                 <w:b w:val="0"/>
-                <w:sz w:val="16"/>
+                <w:i w:val="0"/>
+                <w:sz w:val="18"/>
+              </w:rPr>
+            </w:r>
+          </w:p>
+          <w:p>
+            <w:pPr>
+              <w:spacing w:after="0" w:before="0"/>
+              <w:jc w:val="center"/>
+            </w:pPr>
+            <w:r>
+              <w:rPr>
+                <w:rFonts w:ascii="Times New Roman" w:hAnsi="Times New Roman"/>
+                <w:b w:val="0"/>
+                <w:i w:val="0"/>
+                <w:sz w:val="18"/>
               </w:rPr>
               <w:t>1 250 000</w:t>
             </w:r>
@@ -3252,7 +5582,22 @@
               <w:rPr>
                 <w:rFonts w:ascii="Times New Roman" w:hAnsi="Times New Roman"/>
                 <w:b w:val="0"/>
-                <w:sz w:val="16"/>
+                <w:i w:val="0"/>
+                <w:sz w:val="18"/>
+              </w:rPr>
+            </w:r>
+          </w:p>
+          <w:p>
+            <w:pPr>
+              <w:spacing w:after="0" w:before="0"/>
+              <w:jc w:val="center"/>
+            </w:pPr>
+            <w:r>
+              <w:rPr>
+                <w:rFonts w:ascii="Times New Roman" w:hAnsi="Times New Roman"/>
+                <w:b w:val="0"/>
+                <w:i w:val="0"/>
+                <w:sz w:val="18"/>
               </w:rPr>
               <w:t>5 000 000</w:t>
             </w:r>
@@ -3265,8 +5610,9 @@
             <w:r>
               <w:rPr>
                 <w:rFonts w:ascii="Times New Roman" w:hAnsi="Times New Roman"/>
-                <w:b w:val="0"/>
-                <w:sz w:val="16"/>
+                <w:b/>
+                <w:i/>
+                <w:sz w:val="18"/>
               </w:rPr>
               <w:t>ST : 5 000 000</w:t>
             </w:r>
@@ -3287,6 +5633,7 @@
               <w:rPr>
                 <w:rFonts w:ascii="Times New Roman" w:hAnsi="Times New Roman"/>
                 <w:b w:val="0"/>
+                <w:i w:val="0"/>
                 <w:sz w:val="16"/>
               </w:rPr>
               <w:t>VOI</w:t>
@@ -3308,6 +5655,7 @@
               <w:rPr>
                 <w:rFonts w:ascii="Times New Roman" w:hAnsi="Times New Roman"/>
                 <w:b w:val="0"/>
+                <w:i w:val="0"/>
                 <w:sz w:val="16"/>
               </w:rPr>
               <w:t>VOI</w:t>
@@ -3329,6 +5677,7 @@
               <w:rPr>
                 <w:rFonts w:ascii="Times New Roman" w:hAnsi="Times New Roman"/>
                 <w:b w:val="0"/>
+                <w:i w:val="0"/>
                 <w:sz w:val="16"/>
               </w:rPr>
               <w:t>Filohan’ny FEFFI, Tale</w:t>
@@ -3359,6 +5708,7 @@
               <w:rPr>
                 <w:rFonts w:ascii="Times New Roman" w:hAnsi="Times New Roman"/>
                 <w:b w:val="0"/>
+                <w:i w:val="0"/>
                 <w:sz w:val="16"/>
               </w:rPr>
               <w:t>Famonjena Journées Pédagogiques (JP) sy Sports scolaires / Hetsika</w:t>
@@ -3380,6 +5730,7 @@
               <w:rPr>
                 <w:rFonts w:ascii="Times New Roman" w:hAnsi="Times New Roman"/>
                 <w:b w:val="0"/>
+                <w:i w:val="0"/>
                 <w:sz w:val="16"/>
               </w:rPr>
               <w:t>Septambra 2026 – Jona 2027</w:t>
@@ -3401,7 +5752,8 @@
               <w:rPr>
                 <w:rFonts w:ascii="Times New Roman" w:hAnsi="Times New Roman"/>
                 <w:b w:val="0"/>
-                <w:sz w:val="16"/>
+                <w:i w:val="0"/>
+                <w:sz w:val="18"/>
               </w:rPr>
               <w:t>Fandoavana tsipaipaika :</w:t>
             </w:r>
@@ -3415,7 +5767,8 @@
               <w:rPr>
                 <w:rFonts w:ascii="Times New Roman" w:hAnsi="Times New Roman"/>
                 <w:b w:val="0"/>
-                <w:sz w:val="16"/>
+                <w:i w:val="0"/>
+                <w:sz w:val="18"/>
               </w:rPr>
               <w:t>• Journées Pédagogiques</w:t>
             </w:r>
@@ -3429,7 +5782,8 @@
               <w:rPr>
                 <w:rFonts w:ascii="Times New Roman" w:hAnsi="Times New Roman"/>
                 <w:b w:val="0"/>
-                <w:sz w:val="16"/>
+                <w:i w:val="0"/>
+                <w:sz w:val="18"/>
               </w:rPr>
               <w:t>• Sports scolaires</w:t>
             </w:r>
@@ -3443,7 +5797,8 @@
               <w:rPr>
                 <w:rFonts w:ascii="Times New Roman" w:hAnsi="Times New Roman"/>
                 <w:b w:val="0"/>
-                <w:sz w:val="16"/>
+                <w:i w:val="0"/>
+                <w:sz w:val="18"/>
               </w:rPr>
               <w:t>• Hetsika « vokatra »</w:t>
             </w:r>
@@ -3464,9 +5819,54 @@
               <w:rPr>
                 <w:rFonts w:ascii="Times New Roman" w:hAnsi="Times New Roman"/>
                 <w:b w:val="0"/>
-                <w:sz w:val="16"/>
-              </w:rPr>
-              <w:t>5 5 2</w:t>
+                <w:i w:val="0"/>
+                <w:sz w:val="18"/>
+              </w:rPr>
+            </w:r>
+          </w:p>
+          <w:p>
+            <w:pPr>
+              <w:spacing w:after="0" w:before="0"/>
+              <w:jc w:val="center"/>
+            </w:pPr>
+            <w:r>
+              <w:rPr>
+                <w:rFonts w:ascii="Times New Roman" w:hAnsi="Times New Roman"/>
+                <w:b w:val="0"/>
+                <w:i w:val="0"/>
+                <w:sz w:val="18"/>
+              </w:rPr>
+              <w:t>5</w:t>
+            </w:r>
+          </w:p>
+          <w:p>
+            <w:pPr>
+              <w:spacing w:after="0" w:before="0"/>
+              <w:jc w:val="center"/>
+            </w:pPr>
+            <w:r>
+              <w:rPr>
+                <w:rFonts w:ascii="Times New Roman" w:hAnsi="Times New Roman"/>
+                <w:b w:val="0"/>
+                <w:i w:val="0"/>
+                <w:sz w:val="18"/>
+              </w:rPr>
+              <w:t>5</w:t>
+            </w:r>
+          </w:p>
+          <w:p>
+            <w:pPr>
+              <w:spacing w:after="0" w:before="0"/>
+              <w:jc w:val="center"/>
+            </w:pPr>
+            <w:r>
+              <w:rPr>
+                <w:rFonts w:ascii="Times New Roman" w:hAnsi="Times New Roman"/>
+                <w:b w:val="0"/>
+                <w:i w:val="0"/>
+                <w:sz w:val="18"/>
+              </w:rPr>
+              <w:t>2</w:t>
             </w:r>
           </w:p>
         </w:tc>
@@ -3485,9 +5885,54 @@
               <w:rPr>
                 <w:rFonts w:ascii="Times New Roman" w:hAnsi="Times New Roman"/>
                 <w:b w:val="0"/>
-                <w:sz w:val="16"/>
-              </w:rPr>
-              <w:t>72 000 50 000 35 000</w:t>
+                <w:i w:val="0"/>
+                <w:sz w:val="18"/>
+              </w:rPr>
+            </w:r>
+          </w:p>
+          <w:p>
+            <w:pPr>
+              <w:spacing w:after="0" w:before="0"/>
+              <w:jc w:val="center"/>
+            </w:pPr>
+            <w:r>
+              <w:rPr>
+                <w:rFonts w:ascii="Times New Roman" w:hAnsi="Times New Roman"/>
+                <w:b w:val="0"/>
+                <w:i w:val="0"/>
+                <w:sz w:val="18"/>
+              </w:rPr>
+              <w:t>72 000</w:t>
+            </w:r>
+          </w:p>
+          <w:p>
+            <w:pPr>
+              <w:spacing w:after="0" w:before="0"/>
+              <w:jc w:val="center"/>
+            </w:pPr>
+            <w:r>
+              <w:rPr>
+                <w:rFonts w:ascii="Times New Roman" w:hAnsi="Times New Roman"/>
+                <w:b w:val="0"/>
+                <w:i w:val="0"/>
+                <w:sz w:val="18"/>
+              </w:rPr>
+              <w:t>50 000</w:t>
+            </w:r>
+          </w:p>
+          <w:p>
+            <w:pPr>
+              <w:spacing w:after="0" w:before="0"/>
+              <w:jc w:val="center"/>
+            </w:pPr>
+            <w:r>
+              <w:rPr>
+                <w:rFonts w:ascii="Times New Roman" w:hAnsi="Times New Roman"/>
+                <w:b w:val="0"/>
+                <w:i w:val="0"/>
+                <w:sz w:val="18"/>
+              </w:rPr>
+              <w:t>35 000</w:t>
             </w:r>
           </w:p>
         </w:tc>
@@ -3506,9 +5951,9 @@
               <w:rPr>
                 <w:rFonts w:ascii="Times New Roman" w:hAnsi="Times New Roman"/>
                 <w:b w:val="0"/>
-                <w:sz w:val="16"/>
-              </w:rPr>
-              <w:t>360 000 250 000 70 000</w:t>
+                <w:i w:val="0"/>
+                <w:sz w:val="18"/>
+              </w:rPr>
             </w:r>
           </w:p>
           <w:p>
@@ -3520,7 +5965,53 @@
               <w:rPr>
                 <w:rFonts w:ascii="Times New Roman" w:hAnsi="Times New Roman"/>
                 <w:b w:val="0"/>
-                <w:sz w:val="16"/>
+                <w:i w:val="0"/>
+                <w:sz w:val="18"/>
+              </w:rPr>
+              <w:t>360 000</w:t>
+            </w:r>
+          </w:p>
+          <w:p>
+            <w:pPr>
+              <w:spacing w:after="0" w:before="0"/>
+              <w:jc w:val="center"/>
+            </w:pPr>
+            <w:r>
+              <w:rPr>
+                <w:rFonts w:ascii="Times New Roman" w:hAnsi="Times New Roman"/>
+                <w:b w:val="0"/>
+                <w:i w:val="0"/>
+                <w:sz w:val="18"/>
+              </w:rPr>
+              <w:t>250 000</w:t>
+            </w:r>
+          </w:p>
+          <w:p>
+            <w:pPr>
+              <w:spacing w:after="0" w:before="0"/>
+              <w:jc w:val="center"/>
+            </w:pPr>
+            <w:r>
+              <w:rPr>
+                <w:rFonts w:ascii="Times New Roman" w:hAnsi="Times New Roman"/>
+                <w:b w:val="0"/>
+                <w:i w:val="0"/>
+                <w:sz w:val="18"/>
+              </w:rPr>
+              <w:t>70 000</w:t>
+            </w:r>
+          </w:p>
+          <w:p>
+            <w:pPr>
+              <w:spacing w:after="0" w:before="0"/>
+              <w:jc w:val="center"/>
+            </w:pPr>
+            <w:r>
+              <w:rPr>
+                <w:rFonts w:ascii="Times New Roman" w:hAnsi="Times New Roman"/>
+                <w:b/>
+                <w:i/>
+                <w:sz w:val="18"/>
               </w:rPr>
               <w:t>ST : 680 000</w:t>
             </w:r>
@@ -3541,6 +6032,7 @@
               <w:rPr>
                 <w:rFonts w:ascii="Times New Roman" w:hAnsi="Times New Roman"/>
                 <w:b w:val="0"/>
+                <w:i w:val="0"/>
                 <w:sz w:val="16"/>
               </w:rPr>
               <w:t>VOI</w:t>
@@ -3562,6 +6054,7 @@
               <w:rPr>
                 <w:rFonts w:ascii="Times New Roman" w:hAnsi="Times New Roman"/>
                 <w:b w:val="0"/>
+                <w:i w:val="0"/>
                 <w:sz w:val="16"/>
               </w:rPr>
               <w:t>VOI</w:t>
@@ -3583,6 +6076,7 @@
               <w:rPr>
                 <w:rFonts w:ascii="Times New Roman" w:hAnsi="Times New Roman"/>
                 <w:b w:val="0"/>
+                <w:i w:val="0"/>
                 <w:sz w:val="16"/>
               </w:rPr>
               <w:t>Filohan’ny FEFFI, Tale</w:t>
@@ -3613,6 +6107,7 @@
               <w:rPr>
                 <w:rFonts w:ascii="Times New Roman" w:hAnsi="Times New Roman"/>
                 <w:b w:val="0"/>
+                <w:i w:val="0"/>
                 <w:sz w:val="16"/>
               </w:rPr>
               <w:t>Fandoavana ny fiantohana « Pascoma » sy ny Sports scolaires</w:t>
@@ -3634,6 +6129,7 @@
               <w:rPr>
                 <w:rFonts w:ascii="Times New Roman" w:hAnsi="Times New Roman"/>
                 <w:b w:val="0"/>
+                <w:i w:val="0"/>
                 <w:sz w:val="16"/>
               </w:rPr>
               <w:t>Septambra 2026 – Janoary 2027</w:t>
@@ -3655,7 +6151,8 @@
               <w:rPr>
                 <w:rFonts w:ascii="Times New Roman" w:hAnsi="Times New Roman"/>
                 <w:b w:val="0"/>
-                <w:sz w:val="16"/>
+                <w:i w:val="0"/>
+                <w:sz w:val="18"/>
               </w:rPr>
               <w:t>Fandoavana :</w:t>
             </w:r>
@@ -3669,7 +6166,8 @@
               <w:rPr>
                 <w:rFonts w:ascii="Times New Roman" w:hAnsi="Times New Roman"/>
                 <w:b w:val="0"/>
-                <w:sz w:val="16"/>
+                <w:i w:val="0"/>
+                <w:sz w:val="18"/>
               </w:rPr>
               <w:t>• Pascoma</w:t>
             </w:r>
@@ -3683,7 +6181,8 @@
               <w:rPr>
                 <w:rFonts w:ascii="Times New Roman" w:hAnsi="Times New Roman"/>
                 <w:b w:val="0"/>
-                <w:sz w:val="16"/>
+                <w:i w:val="0"/>
+                <w:sz w:val="18"/>
               </w:rPr>
               <w:t>• Sports scolaire</w:t>
             </w:r>
@@ -3704,9 +6203,39 @@
               <w:rPr>
                 <w:rFonts w:ascii="Times New Roman" w:hAnsi="Times New Roman"/>
                 <w:b w:val="0"/>
-                <w:sz w:val="16"/>
-              </w:rPr>
-              <w:t>140 140</w:t>
+                <w:i w:val="0"/>
+                <w:sz w:val="18"/>
+              </w:rPr>
+            </w:r>
+          </w:p>
+          <w:p>
+            <w:pPr>
+              <w:spacing w:after="0" w:before="0"/>
+              <w:jc w:val="center"/>
+            </w:pPr>
+            <w:r>
+              <w:rPr>
+                <w:rFonts w:ascii="Times New Roman" w:hAnsi="Times New Roman"/>
+                <w:b w:val="0"/>
+                <w:i w:val="0"/>
+                <w:sz w:val="18"/>
+              </w:rPr>
+              <w:t>140</w:t>
+            </w:r>
+          </w:p>
+          <w:p>
+            <w:pPr>
+              <w:spacing w:after="0" w:before="0"/>
+              <w:jc w:val="center"/>
+            </w:pPr>
+            <w:r>
+              <w:rPr>
+                <w:rFonts w:ascii="Times New Roman" w:hAnsi="Times New Roman"/>
+                <w:b w:val="0"/>
+                <w:i w:val="0"/>
+                <w:sz w:val="18"/>
+              </w:rPr>
+              <w:t>140</w:t>
             </w:r>
           </w:p>
         </w:tc>
@@ -3725,9 +6254,39 @@
               <w:rPr>
                 <w:rFonts w:ascii="Times New Roman" w:hAnsi="Times New Roman"/>
                 <w:b w:val="0"/>
-                <w:sz w:val="16"/>
-              </w:rPr>
-              <w:t>200 500</w:t>
+                <w:i w:val="0"/>
+                <w:sz w:val="18"/>
+              </w:rPr>
+            </w:r>
+          </w:p>
+          <w:p>
+            <w:pPr>
+              <w:spacing w:after="0" w:before="0"/>
+              <w:jc w:val="center"/>
+            </w:pPr>
+            <w:r>
+              <w:rPr>
+                <w:rFonts w:ascii="Times New Roman" w:hAnsi="Times New Roman"/>
+                <w:b w:val="0"/>
+                <w:i w:val="0"/>
+                <w:sz w:val="18"/>
+              </w:rPr>
+              <w:t>200</w:t>
+            </w:r>
+          </w:p>
+          <w:p>
+            <w:pPr>
+              <w:spacing w:after="0" w:before="0"/>
+              <w:jc w:val="center"/>
+            </w:pPr>
+            <w:r>
+              <w:rPr>
+                <w:rFonts w:ascii="Times New Roman" w:hAnsi="Times New Roman"/>
+                <w:b w:val="0"/>
+                <w:i w:val="0"/>
+                <w:sz w:val="18"/>
+              </w:rPr>
+              <w:t>500</w:t>
             </w:r>
           </w:p>
         </w:tc>
@@ -3746,9 +6305,39 @@
               <w:rPr>
                 <w:rFonts w:ascii="Times New Roman" w:hAnsi="Times New Roman"/>
                 <w:b w:val="0"/>
-                <w:sz w:val="16"/>
-              </w:rPr>
-              <w:t>28 000 70 000</w:t>
+                <w:i w:val="0"/>
+                <w:sz w:val="18"/>
+              </w:rPr>
+            </w:r>
+          </w:p>
+          <w:p>
+            <w:pPr>
+              <w:spacing w:after="0" w:before="0"/>
+              <w:jc w:val="center"/>
+            </w:pPr>
+            <w:r>
+              <w:rPr>
+                <w:rFonts w:ascii="Times New Roman" w:hAnsi="Times New Roman"/>
+                <w:b w:val="0"/>
+                <w:i w:val="0"/>
+                <w:sz w:val="18"/>
+              </w:rPr>
+              <w:t>28 000</w:t>
+            </w:r>
+          </w:p>
+          <w:p>
+            <w:pPr>
+              <w:spacing w:after="0" w:before="0"/>
+              <w:jc w:val="center"/>
+            </w:pPr>
+            <w:r>
+              <w:rPr>
+                <w:rFonts w:ascii="Times New Roman" w:hAnsi="Times New Roman"/>
+                <w:b w:val="0"/>
+                <w:i w:val="0"/>
+                <w:sz w:val="18"/>
+              </w:rPr>
+              <w:t>70 000</w:t>
             </w:r>
           </w:p>
         </w:tc>
@@ -3767,6 +6356,7 @@
               <w:rPr>
                 <w:rFonts w:ascii="Times New Roman" w:hAnsi="Times New Roman"/>
                 <w:b w:val="0"/>
+                <w:i w:val="0"/>
                 <w:sz w:val="16"/>
               </w:rPr>
               <w:t>VOI ST : 28 000   RPI ST : 70 000</w:t>
@@ -3788,6 +6378,7 @@
               <w:rPr>
                 <w:rFonts w:ascii="Times New Roman" w:hAnsi="Times New Roman"/>
                 <w:b w:val="0"/>
+                <w:i w:val="0"/>
                 <w:sz w:val="16"/>
               </w:rPr>
               <w:t>VOI / FEFFI</w:t>
@@ -3809,6 +6400,7 @@
               <w:rPr>
                 <w:rFonts w:ascii="Times New Roman" w:hAnsi="Times New Roman"/>
                 <w:b w:val="0"/>
+                <w:i w:val="0"/>
                 <w:sz w:val="16"/>
               </w:rPr>
               <w:t>Filohan’ny FEFFI, Tale</w:t>
@@ -3839,6 +6431,7 @@
               <w:rPr>
                 <w:rFonts w:ascii="Times New Roman" w:hAnsi="Times New Roman"/>
                 <w:b w:val="0"/>
+                <w:i w:val="0"/>
                 <w:sz w:val="16"/>
               </w:rPr>
               <w:t>Fampisaafoanana an-tsekoly (Fambolena)</w:t>
@@ -3860,6 +6453,7 @@
               <w:rPr>
                 <w:rFonts w:ascii="Times New Roman" w:hAnsi="Times New Roman"/>
                 <w:b w:val="0"/>
+                <w:i w:val="0"/>
                 <w:sz w:val="16"/>
               </w:rPr>
               <w:t>Oktobra 2026 – Desambra 2026</w:t>
@@ -3881,7 +6475,8 @@
               <w:rPr>
                 <w:rFonts w:ascii="Times New Roman" w:hAnsi="Times New Roman"/>
                 <w:b w:val="0"/>
-                <w:sz w:val="16"/>
+                <w:i w:val="0"/>
+                <w:sz w:val="18"/>
               </w:rPr>
               <w:t>Fambolena :</w:t>
             </w:r>
@@ -3895,7 +6490,8 @@
               <w:rPr>
                 <w:rFonts w:ascii="Times New Roman" w:hAnsi="Times New Roman"/>
                 <w:b w:val="0"/>
-                <w:sz w:val="16"/>
+                <w:i w:val="0"/>
+                <w:sz w:val="18"/>
               </w:rPr>
               <w:t>• Mangahazo (tokony)</w:t>
             </w:r>
@@ -3909,7 +6505,8 @@
               <w:rPr>
                 <w:rFonts w:ascii="Times New Roman" w:hAnsi="Times New Roman"/>
                 <w:b w:val="0"/>
-                <w:sz w:val="16"/>
+                <w:i w:val="0"/>
+                <w:sz w:val="18"/>
               </w:rPr>
               <w:t>• Siramamy (kg)</w:t>
             </w:r>
@@ -3930,9 +6527,39 @@
               <w:rPr>
                 <w:rFonts w:ascii="Times New Roman" w:hAnsi="Times New Roman"/>
                 <w:b w:val="0"/>
-                <w:sz w:val="16"/>
-              </w:rPr>
-              <w:t>60 20</w:t>
+                <w:i w:val="0"/>
+                <w:sz w:val="18"/>
+              </w:rPr>
+            </w:r>
+          </w:p>
+          <w:p>
+            <w:pPr>
+              <w:spacing w:after="0" w:before="0"/>
+              <w:jc w:val="center"/>
+            </w:pPr>
+            <w:r>
+              <w:rPr>
+                <w:rFonts w:ascii="Times New Roman" w:hAnsi="Times New Roman"/>
+                <w:b w:val="0"/>
+                <w:i w:val="0"/>
+                <w:sz w:val="18"/>
+              </w:rPr>
+              <w:t>60</w:t>
+            </w:r>
+          </w:p>
+          <w:p>
+            <w:pPr>
+              <w:spacing w:after="0" w:before="0"/>
+              <w:jc w:val="center"/>
+            </w:pPr>
+            <w:r>
+              <w:rPr>
+                <w:rFonts w:ascii="Times New Roman" w:hAnsi="Times New Roman"/>
+                <w:b w:val="0"/>
+                <w:i w:val="0"/>
+                <w:sz w:val="18"/>
+              </w:rPr>
+              <w:t>20</w:t>
             </w:r>
           </w:p>
         </w:tc>
@@ -3951,9 +6578,39 @@
               <w:rPr>
                 <w:rFonts w:ascii="Times New Roman" w:hAnsi="Times New Roman"/>
                 <w:b w:val="0"/>
-                <w:sz w:val="16"/>
-              </w:rPr>
-              <w:t>1 000 6 000</w:t>
+                <w:i w:val="0"/>
+                <w:sz w:val="18"/>
+              </w:rPr>
+            </w:r>
+          </w:p>
+          <w:p>
+            <w:pPr>
+              <w:spacing w:after="0" w:before="0"/>
+              <w:jc w:val="center"/>
+            </w:pPr>
+            <w:r>
+              <w:rPr>
+                <w:rFonts w:ascii="Times New Roman" w:hAnsi="Times New Roman"/>
+                <w:b w:val="0"/>
+                <w:i w:val="0"/>
+                <w:sz w:val="18"/>
+              </w:rPr>
+              <w:t>1 000</w:t>
+            </w:r>
+          </w:p>
+          <w:p>
+            <w:pPr>
+              <w:spacing w:after="0" w:before="0"/>
+              <w:jc w:val="center"/>
+            </w:pPr>
+            <w:r>
+              <w:rPr>
+                <w:rFonts w:ascii="Times New Roman" w:hAnsi="Times New Roman"/>
+                <w:b w:val="0"/>
+                <w:i w:val="0"/>
+                <w:sz w:val="18"/>
+              </w:rPr>
+              <w:t>6 000</w:t>
             </w:r>
           </w:p>
         </w:tc>
@@ -3972,9 +6629,9 @@
               <w:rPr>
                 <w:rFonts w:ascii="Times New Roman" w:hAnsi="Times New Roman"/>
                 <w:b w:val="0"/>
-                <w:sz w:val="16"/>
-              </w:rPr>
-              <w:t>60 000 120 000</w:t>
+                <w:i w:val="0"/>
+                <w:sz w:val="18"/>
+              </w:rPr>
             </w:r>
           </w:p>
           <w:p>
@@ -3986,7 +6643,38 @@
               <w:rPr>
                 <w:rFonts w:ascii="Times New Roman" w:hAnsi="Times New Roman"/>
                 <w:b w:val="0"/>
-                <w:sz w:val="16"/>
+                <w:i w:val="0"/>
+                <w:sz w:val="18"/>
+              </w:rPr>
+              <w:t>60 000</w:t>
+            </w:r>
+          </w:p>
+          <w:p>
+            <w:pPr>
+              <w:spacing w:after="0" w:before="0"/>
+              <w:jc w:val="center"/>
+            </w:pPr>
+            <w:r>
+              <w:rPr>
+                <w:rFonts w:ascii="Times New Roman" w:hAnsi="Times New Roman"/>
+                <w:b w:val="0"/>
+                <w:i w:val="0"/>
+                <w:sz w:val="18"/>
+              </w:rPr>
+              <w:t>120 000</w:t>
+            </w:r>
+          </w:p>
+          <w:p>
+            <w:pPr>
+              <w:spacing w:after="0" w:before="0"/>
+              <w:jc w:val="center"/>
+            </w:pPr>
+            <w:r>
+              <w:rPr>
+                <w:rFonts w:ascii="Times New Roman" w:hAnsi="Times New Roman"/>
+                <w:b/>
+                <w:i/>
+                <w:sz w:val="18"/>
               </w:rPr>
               <w:t>ST : 180 000</w:t>
             </w:r>
@@ -4007,6 +6695,7 @@
               <w:rPr>
                 <w:rFonts w:ascii="Times New Roman" w:hAnsi="Times New Roman"/>
                 <w:b w:val="0"/>
+                <w:i w:val="0"/>
                 <w:sz w:val="16"/>
               </w:rPr>
               <w:t>VOI</w:t>
@@ -4028,6 +6717,7 @@
               <w:rPr>
                 <w:rFonts w:ascii="Times New Roman" w:hAnsi="Times New Roman"/>
                 <w:b w:val="0"/>
+                <w:i w:val="0"/>
                 <w:sz w:val="16"/>
               </w:rPr>
               <w:t>VOI</w:t>
@@ -4049,6 +6739,7 @@
               <w:rPr>
                 <w:rFonts w:ascii="Times New Roman" w:hAnsi="Times New Roman"/>
                 <w:b w:val="0"/>
+                <w:i w:val="0"/>
                 <w:sz w:val="16"/>
               </w:rPr>
               <w:t>Filohan’ny FEFFI, Tale</w:t>
@@ -4073,6 +6764,7 @@
               <w:rPr>
                 <w:rFonts w:ascii="Times New Roman" w:hAnsi="Times New Roman"/>
                 <w:b/>
+                <w:i w:val="0"/>
                 <w:sz w:val="16"/>
               </w:rPr>
               <w:t>FAMPANDEHANANA NY FEFFI SY VFF</w:t>
@@ -4094,6 +6786,7 @@
               <w:rPr>
                 <w:rFonts w:ascii="Times New Roman" w:hAnsi="Times New Roman"/>
                 <w:b w:val="0"/>
+                <w:i w:val="0"/>
                 <w:sz w:val="16"/>
               </w:rPr>
               <w:t>Fampitaovana ny birao</w:t>
@@ -4115,6 +6808,7 @@
               <w:rPr>
                 <w:rFonts w:ascii="Times New Roman" w:hAnsi="Times New Roman"/>
                 <w:b w:val="0"/>
+                <w:i w:val="0"/>
                 <w:sz w:val="16"/>
               </w:rPr>
               <w:t>Septambra 2026</w:t>
@@ -4136,7 +6830,8 @@
               <w:rPr>
                 <w:rFonts w:ascii="Times New Roman" w:hAnsi="Times New Roman"/>
                 <w:b w:val="0"/>
-                <w:sz w:val="16"/>
+                <w:i w:val="0"/>
+                <w:sz w:val="18"/>
               </w:rPr>
               <w:t>Fividianana :</w:t>
             </w:r>
@@ -4150,7 +6845,8 @@
               <w:rPr>
                 <w:rFonts w:ascii="Times New Roman" w:hAnsi="Times New Roman"/>
                 <w:b w:val="0"/>
-                <w:sz w:val="16"/>
+                <w:i w:val="0"/>
+                <w:sz w:val="18"/>
               </w:rPr>
               <w:t>• Gony 250 kg</w:t>
             </w:r>
@@ -4171,7 +6867,22 @@
               <w:rPr>
                 <w:rFonts w:ascii="Times New Roman" w:hAnsi="Times New Roman"/>
                 <w:b w:val="0"/>
-                <w:sz w:val="16"/>
+                <w:i w:val="0"/>
+                <w:sz w:val="18"/>
+              </w:rPr>
+            </w:r>
+          </w:p>
+          <w:p>
+            <w:pPr>
+              <w:spacing w:after="0" w:before="0"/>
+              <w:jc w:val="center"/>
+            </w:pPr>
+            <w:r>
+              <w:rPr>
+                <w:rFonts w:ascii="Times New Roman" w:hAnsi="Times New Roman"/>
+                <w:b w:val="0"/>
+                <w:i w:val="0"/>
+                <w:sz w:val="18"/>
               </w:rPr>
               <w:t>1</w:t>
             </w:r>
@@ -4192,7 +6903,22 @@
               <w:rPr>
                 <w:rFonts w:ascii="Times New Roman" w:hAnsi="Times New Roman"/>
                 <w:b w:val="0"/>
-                <w:sz w:val="16"/>
+                <w:i w:val="0"/>
+                <w:sz w:val="18"/>
+              </w:rPr>
+            </w:r>
+          </w:p>
+          <w:p>
+            <w:pPr>
+              <w:spacing w:after="0" w:before="0"/>
+              <w:jc w:val="center"/>
+            </w:pPr>
+            <w:r>
+              <w:rPr>
+                <w:rFonts w:ascii="Times New Roman" w:hAnsi="Times New Roman"/>
+                <w:b w:val="0"/>
+                <w:i w:val="0"/>
+                <w:sz w:val="18"/>
               </w:rPr>
               <w:t>4 000</w:t>
             </w:r>
@@ -4213,7 +6939,22 @@
               <w:rPr>
                 <w:rFonts w:ascii="Times New Roman" w:hAnsi="Times New Roman"/>
                 <w:b w:val="0"/>
-                <w:sz w:val="16"/>
+                <w:i w:val="0"/>
+                <w:sz w:val="18"/>
+              </w:rPr>
+            </w:r>
+          </w:p>
+          <w:p>
+            <w:pPr>
+              <w:spacing w:after="0" w:before="0"/>
+              <w:jc w:val="center"/>
+            </w:pPr>
+            <w:r>
+              <w:rPr>
+                <w:rFonts w:ascii="Times New Roman" w:hAnsi="Times New Roman"/>
+                <w:b w:val="0"/>
+                <w:i w:val="0"/>
+                <w:sz w:val="18"/>
               </w:rPr>
               <w:t>4 000</w:t>
             </w:r>
@@ -4226,8 +6967,9 @@
             <w:r>
               <w:rPr>
                 <w:rFonts w:ascii="Times New Roman" w:hAnsi="Times New Roman"/>
-                <w:b w:val="0"/>
-                <w:sz w:val="16"/>
+                <w:b/>
+                <w:i/>
+                <w:sz w:val="18"/>
               </w:rPr>
               <w:t>ST : 4 000</w:t>
             </w:r>
@@ -4248,6 +6990,7 @@
               <w:rPr>
                 <w:rFonts w:ascii="Times New Roman" w:hAnsi="Times New Roman"/>
                 <w:b w:val="0"/>
+                <w:i w:val="0"/>
                 <w:sz w:val="16"/>
               </w:rPr>
               <w:t>Caisse école : FCE</w:t>
@@ -4269,6 +7012,7 @@
               <w:rPr>
                 <w:rFonts w:ascii="Times New Roman" w:hAnsi="Times New Roman"/>
                 <w:b w:val="0"/>
+                <w:i w:val="0"/>
                 <w:sz w:val="16"/>
               </w:rPr>
               <w:t>FEFFI</w:t>
@@ -4290,6 +7034,7 @@
               <w:rPr>
                 <w:rFonts w:ascii="Times New Roman" w:hAnsi="Times New Roman"/>
                 <w:b w:val="0"/>
+                <w:i w:val="0"/>
                 <w:sz w:val="16"/>
               </w:rPr>
               <w:t>Ny Filohan’ny FEFFI, Ny Mpitam-bola, Ny Mpitam-tsoratra</w:t>
@@ -4320,6 +7065,7 @@
               <w:rPr>
                 <w:rFonts w:ascii="Times New Roman" w:hAnsi="Times New Roman"/>
                 <w:b w:val="0"/>
+                <w:i w:val="0"/>
                 <w:sz w:val="16"/>
               </w:rPr>
               <w:t>Fampandraharana ny VFF</w:t>
@@ -4341,6 +7087,7 @@
               <w:rPr>
                 <w:rFonts w:ascii="Times New Roman" w:hAnsi="Times New Roman"/>
                 <w:b w:val="0"/>
+                <w:i w:val="0"/>
                 <w:sz w:val="16"/>
               </w:rPr>
               <w:t>Septambra 2026 – Janoary 2027</w:t>
@@ -4362,7 +7109,8 @@
               <w:rPr>
                 <w:rFonts w:ascii="Times New Roman" w:hAnsi="Times New Roman"/>
                 <w:b w:val="0"/>
-                <w:sz w:val="16"/>
+                <w:i w:val="0"/>
+                <w:sz w:val="18"/>
               </w:rPr>
               <w:t>Hetsika VFF</w:t>
             </w:r>
@@ -4383,7 +7131,8 @@
               <w:rPr>
                 <w:rFonts w:ascii="Times New Roman" w:hAnsi="Times New Roman"/>
                 <w:b w:val="0"/>
-                <w:sz w:val="16"/>
+                <w:i w:val="0"/>
+                <w:sz w:val="18"/>
               </w:rPr>
               <w:t>1</w:t>
             </w:r>
@@ -4404,7 +7153,8 @@
               <w:rPr>
                 <w:rFonts w:ascii="Times New Roman" w:hAnsi="Times New Roman"/>
                 <w:b w:val="0"/>
-                <w:sz w:val="16"/>
+                <w:i w:val="0"/>
+                <w:sz w:val="18"/>
               </w:rPr>
               <w:t>50 000</w:t>
             </w:r>
@@ -4425,7 +7175,8 @@
               <w:rPr>
                 <w:rFonts w:ascii="Times New Roman" w:hAnsi="Times New Roman"/>
                 <w:b w:val="0"/>
-                <w:sz w:val="16"/>
+                <w:i w:val="0"/>
+                <w:sz w:val="18"/>
               </w:rPr>
               <w:t>50 000</w:t>
             </w:r>
@@ -4438,8 +7189,9 @@
             <w:r>
               <w:rPr>
                 <w:rFonts w:ascii="Times New Roman" w:hAnsi="Times New Roman"/>
-                <w:b w:val="0"/>
-                <w:sz w:val="16"/>
+                <w:b/>
+                <w:i/>
+                <w:sz w:val="18"/>
               </w:rPr>
               <w:t>ST : 50 000</w:t>
             </w:r>
@@ -4460,6 +7212,7 @@
               <w:rPr>
                 <w:rFonts w:ascii="Times New Roman" w:hAnsi="Times New Roman"/>
                 <w:b w:val="0"/>
+                <w:i w:val="0"/>
                 <w:sz w:val="16"/>
               </w:rPr>
               <w:t>VOI</w:t>
@@ -4481,6 +7234,7 @@
               <w:rPr>
                 <w:rFonts w:ascii="Times New Roman" w:hAnsi="Times New Roman"/>
                 <w:b w:val="0"/>
+                <w:i w:val="0"/>
                 <w:sz w:val="16"/>
               </w:rPr>
               <w:t>VOI</w:t>
@@ -4502,6 +7256,7 @@
               <w:rPr>
                 <w:rFonts w:ascii="Times New Roman" w:hAnsi="Times New Roman"/>
                 <w:b w:val="0"/>
+                <w:i w:val="0"/>
                 <w:sz w:val="16"/>
               </w:rPr>
               <w:t>Filohan’ny FEFFI, Tale</w:t>
@@ -4533,6 +7288,7 @@
               <w:rPr>
                 <w:rFonts w:ascii="Times New Roman" w:hAnsi="Times New Roman"/>
                 <w:b w:val="0"/>
+                <w:i w:val="0"/>
                 <w:sz w:val="16"/>
               </w:rPr>
               <w:t>Fivezivezen’ny mpiambana ao amin’ny BM FEFFI</w:t>
@@ -4555,6 +7311,7 @@
               <w:rPr>
                 <w:rFonts w:ascii="Times New Roman" w:hAnsi="Times New Roman"/>
                 <w:b w:val="0"/>
+                <w:i w:val="0"/>
                 <w:sz w:val="16"/>
               </w:rPr>
               <w:t>Septambra 2026</w:t>
@@ -4576,7 +7333,8 @@
               <w:rPr>
                 <w:rFonts w:ascii="Times New Roman" w:hAnsi="Times New Roman"/>
                 <w:b w:val="0"/>
-                <w:sz w:val="16"/>
+                <w:i w:val="0"/>
+                <w:sz w:val="18"/>
               </w:rPr>
               <w:t>• Saran-dalana (FCE)</w:t>
             </w:r>
@@ -4597,7 +7355,8 @@
               <w:rPr>
                 <w:rFonts w:ascii="Times New Roman" w:hAnsi="Times New Roman"/>
                 <w:b w:val="0"/>
-                <w:sz w:val="16"/>
+                <w:i w:val="0"/>
+                <w:sz w:val="18"/>
               </w:rPr>
               <w:t>3</w:t>
             </w:r>
@@ -4618,7 +7377,8 @@
               <w:rPr>
                 <w:rFonts w:ascii="Times New Roman" w:hAnsi="Times New Roman"/>
                 <w:b w:val="0"/>
-                <w:sz w:val="16"/>
+                <w:i w:val="0"/>
+                <w:sz w:val="18"/>
               </w:rPr>
               <w:t>20 000</w:t>
             </w:r>
@@ -4639,7 +7399,8 @@
               <w:rPr>
                 <w:rFonts w:ascii="Times New Roman" w:hAnsi="Times New Roman"/>
                 <w:b w:val="0"/>
-                <w:sz w:val="16"/>
+                <w:i w:val="0"/>
+                <w:sz w:val="18"/>
               </w:rPr>
               <w:t>60 000</w:t>
             </w:r>
@@ -4652,8 +7413,9 @@
             <w:r>
               <w:rPr>
                 <w:rFonts w:ascii="Times New Roman" w:hAnsi="Times New Roman"/>
-                <w:b w:val="0"/>
-                <w:sz w:val="16"/>
+                <w:b/>
+                <w:i/>
+                <w:sz w:val="18"/>
               </w:rPr>
               <w:t>ST : 60 000</w:t>
             </w:r>
@@ -4674,6 +7436,7 @@
               <w:rPr>
                 <w:rFonts w:ascii="Times New Roman" w:hAnsi="Times New Roman"/>
                 <w:b w:val="0"/>
+                <w:i w:val="0"/>
                 <w:sz w:val="16"/>
               </w:rPr>
               <w:t>Caisse école : FCE</w:t>
@@ -4695,6 +7458,7 @@
               <w:rPr>
                 <w:rFonts w:ascii="Times New Roman" w:hAnsi="Times New Roman"/>
                 <w:b w:val="0"/>
+                <w:i w:val="0"/>
                 <w:sz w:val="16"/>
               </w:rPr>
               <w:t>FEFFI</w:t>
@@ -4716,6 +7480,7 @@
               <w:rPr>
                 <w:rFonts w:ascii="Times New Roman" w:hAnsi="Times New Roman"/>
                 <w:b w:val="0"/>
+                <w:i w:val="0"/>
                 <w:sz w:val="16"/>
               </w:rPr>
               <w:t>Ny Filohan’ny FEFFI, Ny Mpitam-bola, Ny Mpitam-tsoratra</w:t>
@@ -4760,7 +7525,8 @@
               <w:rPr>
                 <w:rFonts w:ascii="Times New Roman" w:hAnsi="Times New Roman"/>
                 <w:b w:val="0"/>
-                <w:sz w:val="16"/>
+                <w:i w:val="0"/>
+                <w:sz w:val="18"/>
               </w:rPr>
               <w:t>• Saran-dalana (RPI)</w:t>
             </w:r>
@@ -4781,7 +7547,8 @@
               <w:rPr>
                 <w:rFonts w:ascii="Times New Roman" w:hAnsi="Times New Roman"/>
                 <w:b w:val="0"/>
-                <w:sz w:val="16"/>
+                <w:i w:val="0"/>
+                <w:sz w:val="18"/>
               </w:rPr>
               <w:t>3</w:t>
             </w:r>
@@ -4802,7 +7569,8 @@
               <w:rPr>
                 <w:rFonts w:ascii="Times New Roman" w:hAnsi="Times New Roman"/>
                 <w:b w:val="0"/>
-                <w:sz w:val="16"/>
+                <w:i w:val="0"/>
+                <w:sz w:val="18"/>
               </w:rPr>
               <w:t>30 000</w:t>
             </w:r>
@@ -4823,7 +7591,8 @@
               <w:rPr>
                 <w:rFonts w:ascii="Times New Roman" w:hAnsi="Times New Roman"/>
                 <w:b w:val="0"/>
-                <w:sz w:val="16"/>
+                <w:i w:val="0"/>
+                <w:sz w:val="18"/>
               </w:rPr>
               <w:t>90 000</w:t>
             </w:r>
@@ -4836,8 +7605,9 @@
             <w:r>
               <w:rPr>
                 <w:rFonts w:ascii="Times New Roman" w:hAnsi="Times New Roman"/>
-                <w:b w:val="0"/>
-                <w:sz w:val="16"/>
+                <w:b/>
+                <w:i/>
+                <w:sz w:val="18"/>
               </w:rPr>
               <w:t>ST : 90 000</w:t>
             </w:r>
@@ -4858,6 +7628,7 @@
               <w:rPr>
                 <w:rFonts w:ascii="Times New Roman" w:hAnsi="Times New Roman"/>
                 <w:b w:val="0"/>
+                <w:i w:val="0"/>
                 <w:sz w:val="16"/>
               </w:rPr>
               <w:t>Caisse école : RPI</w:t>
@@ -4879,6 +7650,7 @@
               <w:rPr>
                 <w:rFonts w:ascii="Times New Roman" w:hAnsi="Times New Roman"/>
                 <w:b w:val="0"/>
+                <w:i w:val="0"/>
                 <w:sz w:val="16"/>
               </w:rPr>
               <w:t>FEFFI</w:t>
@@ -4900,6 +7672,7 @@
               <w:rPr>
                 <w:rFonts w:ascii="Times New Roman" w:hAnsi="Times New Roman"/>
                 <w:b w:val="0"/>
+                <w:i w:val="0"/>
                 <w:sz w:val="16"/>
               </w:rPr>
               <w:t>Ny Filohan’ny FEFFI, Ny Mpitam-bola, Ny Mpitam-tsoratra</w:t>
@@ -4957,7 +7730,7 @@
           <w:b w:val="0"/>
           <w:sz w:val="18"/>
         </w:rPr>
-        <w:t>Ankizy voailika niditra an-tsekoly : ……</w:t>
+        <w:t>Ankizy voailika niditra an-tsekoly : 0</w:t>
       </w:r>
     </w:p>
     <w:p>
@@ -4970,7 +7743,7 @@
           <w:b w:val="0"/>
           <w:sz w:val="18"/>
         </w:rPr>
-        <w:t>Natao teto Andranomafana, androany faha-…… Septambra 2026</w:t>
+        <w:t>Natao teto Andranomafana, androany faha-04 Septambra 2026</w:t>
       </w:r>
     </w:p>
     <w:tbl>
@@ -5007,6 +7780,7 @@
               <w:rPr>
                 <w:rFonts w:ascii="Times New Roman" w:hAnsi="Times New Roman"/>
                 <w:b/>
+                <w:i w:val="0"/>
                 <w:sz w:val="20"/>
               </w:rPr>
               <w:t>NY FILOHA BM FEFFI</w:t>
@@ -5028,6 +7802,7 @@
               <w:rPr>
                 <w:rFonts w:ascii="Times New Roman" w:hAnsi="Times New Roman"/>
                 <w:b/>
+                <w:i w:val="0"/>
                 <w:sz w:val="20"/>
               </w:rPr>
               <w:t>NY SEKRETERAN’NY FEFFI</w:t>
@@ -5049,6 +7824,7 @@
               <w:rPr>
                 <w:rFonts w:ascii="Times New Roman" w:hAnsi="Times New Roman"/>
                 <w:b/>
+                <w:i w:val="0"/>
                 <w:sz w:val="20"/>
               </w:rPr>
               <w:t>MPANDRINDRA NY FB</w:t>

</xml_diff>